<commit_message>
Apply expanding workbook layout to all staff forms
</commit_message>
<xml_diff>
--- a/public/assets/Arrange_and_Hand_Over_v12.docx
+++ b/public/assets/Arrange_and_Hand_Over_v12.docx
@@ -1,11 +1,12 @@
 
 <file path=word/document.xml><?xml version="1.0" encoding="utf-8"?>
 <w:document xmlns:wpc="http://schemas.microsoft.com/office/word/2010/wordprocessingCanvas" xmlns:mo="http://schemas.microsoft.com/office/mac/office/2008/main" xmlns:mc="http://schemas.openxmlformats.org/markup-compatibility/2006" xmlns:mv="urn:schemas-microsoft-com:mac:vml" xmlns:o="urn:schemas-microsoft-com:office:office" xmlns:r="http://schemas.openxmlformats.org/officeDocument/2006/relationships" xmlns:m="http://schemas.openxmlformats.org/officeDocument/2006/math" xmlns:v="urn:schemas-microsoft-com:vml" xmlns:wp14="http://schemas.microsoft.com/office/word/2010/wordprocessingDrawing" xmlns:wp="http://schemas.openxmlformats.org/drawingml/2006/wordprocessingDrawing" xmlns:w10="urn:schemas-microsoft-com:office:word" xmlns:w="http://schemas.openxmlformats.org/wordprocessingml/2006/main" xmlns:w14="http://schemas.microsoft.com/office/word/2010/wordml" xmlns:wpg="http://schemas.microsoft.com/office/word/2010/wordprocessingGroup" xmlns:wpi="http://schemas.microsoft.com/office/word/2010/wordprocessingInk" xmlns:wne="http://schemas.microsoft.com/office/word/2006/wordml" xmlns:wps="http://schemas.microsoft.com/office/word/2010/wordprocessingShape" mc:Ignorable="w14 wp14">
+  <w:background w:color="EDF2F3"/>
   <w:body>
     <w:p>
       <w:pPr>
         <w:pStyle w:val="Title"/>
-        <w:keepNext/>
+        <w:spacing w:after="120"/>
       </w:pPr>
       <w:r>
         <w:t>Arrange the call</w:t>
@@ -13,92 +14,186 @@
     </w:p>
     <w:p>
       <w:pPr>
-        <w:keepNext w:val="0"/>
+        <w:spacing w:after="100"/>
       </w:pPr>
       <w:r>
         <w:rPr>
-          <w:sz w:val="19"/>
+          <w:sz w:val="27"/>
         </w:rPr>
-        <w:t>Lived Experience Coordinator · Use the offer form; do not copy its details again.</w:t>
+        <w:t>Lived Experience Coordinator · Type in the white boxes and tick one answer.</w:t>
       </w:r>
     </w:p>
     <w:p>
       <w:pPr>
-        <w:keepNext w:val="0"/>
+        <w:spacing w:after="160"/>
       </w:pPr>
       <w:r>
         <w:rPr>
-          <w:sz w:val="19"/>
+          <w:sz w:val="24"/>
         </w:rPr>
         <w:t>Area: [optional]   |   Team: [optional]</w:t>
       </w:r>
     </w:p>
     <w:p>
       <w:pPr>
-        <w:keepNext w:val="0"/>
+        <w:spacing w:after="120"/>
       </w:pPr>
-      <w:r/>
       <w:r>
         <w:rPr>
-          <w:b/>
+          <w:sz w:val="27"/>
         </w:rPr>
-        <w:t xml:space="preserve">Record reference  </w:t>
+        <w:t>Use the offer form. There is no need to copy its details again.</w:t>
       </w:r>
-      <w:sdt>
-        <w:sdtPr>
-          <w:alias w:val="Record reference"/>
-          <w:tag w:val="handover_1001"/>
-          <w:id w:val="1001"/>
-          <w:text w:multiLine="1"/>
-        </w:sdtPr>
-        <w:sdtContent>
-          <w:r>
-            <w:rPr>
-              <w:rFonts w:ascii="Arial" w:hAnsi="Arial"/>
-              <w:sz w:val="22"/>
-              <w:color w:val="47545B"/>
-              <w:shd w:fill="F2F5F6" w:val="clear"/>
-            </w:rPr>
-            <w:t xml:space="preserve">Reference</w:t>
-          </w:r>
-        </w:sdtContent>
-      </w:sdt>
+    </w:p>
+    <w:tbl>
+      <w:tblPr>
+        <w:tblW w:type="auto" w:w="0"/>
+        <w:tblLayout w:type="fixed"/>
+        <w:tblLook w:firstColumn="1" w:firstRow="1" w:lastColumn="0" w:lastRow="0" w:noHBand="0" w:noVBand="1" w:val="04A0"/>
+      </w:tblPr>
+      <w:tblGrid>
+        <w:gridCol w:w="5102"/>
+        <w:gridCol w:w="5102"/>
+      </w:tblGrid>
+      <w:tr>
+        <w:tc>
+          <w:tcPr>
+            <w:tcW w:type="dxa" w:w="5103"/>
+          </w:tcPr>
+          <w:p>
+            <w:pPr>
+              <w:keepNext/>
+              <w:spacing w:after="60"/>
+            </w:pPr>
+            <w:r>
+              <w:rPr>
+                <w:sz w:val="26"/>
+              </w:rPr>
+              <w:t>Record reference</w:t>
+            </w:r>
+          </w:p>
+        </w:tc>
+        <w:tc>
+          <w:tcPr>
+            <w:tcW w:type="dxa" w:w="5103"/>
+          </w:tcPr>
+          <w:p>
+            <w:pPr>
+              <w:keepNext/>
+              <w:spacing w:after="60"/>
+            </w:pPr>
+            <w:r>
+              <w:rPr>
+                <w:sz w:val="26"/>
+              </w:rPr>
+              <w:t>Coordinator and date</w:t>
+            </w:r>
+          </w:p>
+        </w:tc>
+      </w:tr>
+      <w:tr>
+        <w:trPr>
+          <w:trHeight w:val="560" w:hRule="atLeast"/>
+        </w:trPr>
+        <w:tc>
+          <w:tcPr>
+            <w:tcW w:type="dxa" w:w="5103"/>
+            <w:vAlign w:val="top"/>
+            <w:shd w:fill="FFFFFF"/>
+            <w:tcBorders>
+              <w:top w:val="single" w:sz="6" w:color="71838D"/>
+              <w:left w:val="single" w:sz="6" w:color="71838D"/>
+              <w:bottom w:val="single" w:sz="6" w:color="71838D"/>
+              <w:right w:val="single" w:sz="6" w:color="71838D"/>
+            </w:tcBorders>
+            <w:tcMar>
+              <w:top w:w="115" w:type="dxa"/>
+              <w:bottom w:w="115" w:type="dxa"/>
+              <w:left w:w="115" w:type="dxa"/>
+              <w:right w:w="115" w:type="dxa"/>
+            </w:tcMar>
+          </w:tcPr>
+          <w:sdt>
+            <w:sdtPr>
+              <w:alias w:val="Record reference"/>
+              <w:tag w:val="record_reference"/>
+              <w:id w:val="100"/>
+              <w:text w:multiLine="1"/>
+            </w:sdtPr>
+            <w:sdtContent>
+              <w:p>
+                <w:pPr>
+                  <w:pStyle w:val="Answer"/>
+                </w:pPr>
+                <w:r>
+                  <w:rPr>
+                    <w:rFonts w:ascii="Frutiger LT Com 45 Light" w:hAnsi="Frutiger LT Com 45 Light"/>
+                    <w:sz w:val="28"/>
+                  </w:rPr>
+                  <w:t xml:space="preserve"> </w:t>
+                </w:r>
+              </w:p>
+            </w:sdtContent>
+          </w:sdt>
+        </w:tc>
+        <w:tc>
+          <w:tcPr>
+            <w:tcW w:type="dxa" w:w="5103"/>
+            <w:vAlign w:val="top"/>
+            <w:shd w:fill="FFFFFF"/>
+            <w:tcBorders>
+              <w:top w:val="single" w:sz="6" w:color="71838D"/>
+              <w:left w:val="single" w:sz="6" w:color="71838D"/>
+              <w:bottom w:val="single" w:sz="6" w:color="71838D"/>
+              <w:right w:val="single" w:sz="6" w:color="71838D"/>
+            </w:tcBorders>
+            <w:tcMar>
+              <w:top w:w="115" w:type="dxa"/>
+              <w:bottom w:w="115" w:type="dxa"/>
+              <w:left w:w="115" w:type="dxa"/>
+              <w:right w:w="115" w:type="dxa"/>
+            </w:tcMar>
+          </w:tcPr>
+          <w:sdt>
+            <w:sdtPr>
+              <w:alias w:val="Coordinator and date"/>
+              <w:tag w:val="coordinator_date"/>
+              <w:id w:val="101"/>
+              <w:text w:multiLine="1"/>
+            </w:sdtPr>
+            <w:sdtContent>
+              <w:p>
+                <w:pPr>
+                  <w:pStyle w:val="Answer"/>
+                </w:pPr>
+                <w:r>
+                  <w:rPr>
+                    <w:rFonts w:ascii="Frutiger LT Com 45 Light" w:hAnsi="Frutiger LT Com 45 Light"/>
+                    <w:sz w:val="28"/>
+                  </w:rPr>
+                  <w:t xml:space="preserve"> </w:t>
+                </w:r>
+              </w:p>
+            </w:sdtContent>
+          </w:sdt>
+        </w:tc>
+      </w:tr>
+    </w:tbl>
+    <w:p>
+      <w:pPr>
+        <w:spacing w:after="0" w:before="0" w:line="60" w:lineRule="exact"/>
+      </w:pPr>
+      <w:r>
+        <w:rPr>
+          <w:sz w:val="2"/>
+        </w:rPr>
+      </w:r>
     </w:p>
     <w:p>
       <w:pPr>
-        <w:keepNext w:val="0"/>
-      </w:pPr>
-      <w:r/>
-      <w:r>
-        <w:rPr>
-          <w:b/>
-        </w:rPr>
-        <w:t xml:space="preserve">Coordinator and date  </w:t>
-      </w:r>
-      <w:sdt>
-        <w:sdtPr>
-          <w:alias w:val="Coordinator and date"/>
-          <w:tag w:val="handover_1002"/>
-          <w:id w:val="1002"/>
-          <w:text w:multiLine="1"/>
-        </w:sdtPr>
-        <w:sdtContent>
-          <w:r>
-            <w:rPr>
-              <w:rFonts w:ascii="Arial" w:hAnsi="Arial"/>
-              <w:sz w:val="22"/>
-              <w:color w:val="47545B"/>
-              <w:shd w:fill="F2F5F6" w:val="clear"/>
-            </w:rPr>
-            <w:t xml:space="preserve">Name · date</w:t>
-          </w:r>
-        </w:sdtContent>
-      </w:sdt>
-    </w:p>
-    <w:p>
-      <w:pPr>
-        <w:pStyle w:val="Heading2"/>
-        <w:keepNext/>
+        <w:pStyle w:val="Heading1"/>
+        <w:pageBreakBefore w:val="0"/>
+        <w:spacing w:after="140"/>
       </w:pPr>
       <w:r>
         <w:t>1 Agree the caller</w:t>
@@ -106,277 +201,607 @@
     </w:p>
     <w:p>
       <w:pPr>
-        <w:keepNext w:val="0"/>
+        <w:pStyle w:val="Heading2"/>
+        <w:spacing w:after="120"/>
       </w:pPr>
-      <w:r/>
+      <w:r>
+        <w:t>Caller and agreed call time</w:t>
+      </w:r>
+    </w:p>
+    <w:tbl>
+      <w:tblPr>
+        <w:tblW w:type="auto" w:w="0"/>
+        <w:jc w:val="left"/>
+        <w:tblLayout w:type="fixed"/>
+        <w:tblLook w:firstColumn="1" w:firstRow="1" w:lastColumn="0" w:lastRow="0" w:noHBand="0" w:noVBand="1" w:val="04A0"/>
+      </w:tblPr>
+      <w:tblGrid>
+        <w:gridCol w:w="10205"/>
+      </w:tblGrid>
+      <w:tr>
+        <w:trPr>
+          <w:trHeight w:val="1100" w:hRule="atLeast"/>
+        </w:trPr>
+        <w:tc>
+          <w:tcPr>
+            <w:tcW w:type="dxa" w:w="10206"/>
+            <w:vAlign w:val="top"/>
+            <w:shd w:fill="FFFFFF"/>
+            <w:tcBorders>
+              <w:top w:val="single" w:sz="6" w:color="71838D"/>
+              <w:left w:val="single" w:sz="6" w:color="71838D"/>
+              <w:bottom w:val="single" w:sz="6" w:color="71838D"/>
+              <w:right w:val="single" w:sz="6" w:color="71838D"/>
+            </w:tcBorders>
+            <w:tcMar>
+              <w:top w:w="115" w:type="dxa"/>
+              <w:bottom w:w="115" w:type="dxa"/>
+              <w:left w:w="115" w:type="dxa"/>
+              <w:right w:w="115" w:type="dxa"/>
+            </w:tcMar>
+          </w:tcPr>
+          <w:sdt>
+            <w:sdtPr>
+              <w:alias w:val="Caller and agreed call time"/>
+              <w:tag w:val="caller_and_time"/>
+              <w:id w:val="102"/>
+              <w:text w:multiLine="1"/>
+            </w:sdtPr>
+            <w:sdtContent>
+              <w:p>
+                <w:pPr>
+                  <w:pStyle w:val="Answer"/>
+                </w:pPr>
+                <w:r>
+                  <w:rPr>
+                    <w:rFonts w:ascii="Frutiger LT Com 45 Light" w:hAnsi="Frutiger LT Com 45 Light"/>
+                    <w:sz w:val="28"/>
+                  </w:rPr>
+                  <w:t xml:space="preserve"> </w:t>
+                </w:r>
+              </w:p>
+            </w:sdtContent>
+          </w:sdt>
+        </w:tc>
+      </w:tr>
+    </w:tbl>
+    <w:p>
+      <w:pPr>
+        <w:spacing w:after="0" w:before="0" w:line="60" w:lineRule="exact"/>
+      </w:pPr>
       <w:r>
         <w:rPr>
-          <w:b/>
+          <w:sz w:val="2"/>
         </w:rPr>
-        <w:t xml:space="preserve">Caller and agreed call time  </w:t>
       </w:r>
-      <w:sdt>
-        <w:sdtPr>
-          <w:alias w:val="Caller and agreed call time"/>
-          <w:tag w:val="handover_1003"/>
-          <w:id w:val="1003"/>
-          <w:text w:multiLine="1"/>
-        </w:sdtPr>
-        <w:sdtContent>
-          <w:r>
-            <w:rPr>
-              <w:rFonts w:ascii="Arial" w:hAnsi="Arial"/>
-              <w:sz w:val="22"/>
-              <w:color w:val="47545B"/>
-              <w:shd w:fill="F2F5F6" w:val="clear"/>
-            </w:rPr>
-            <w:t xml:space="preserve">Name · date or time window</w:t>
-          </w:r>
-        </w:sdtContent>
-      </w:sdt>
     </w:p>
     <w:p>
       <w:pPr>
-        <w:keepNext w:val="0"/>
+        <w:pStyle w:val="Heading2"/>
+        <w:spacing w:after="120"/>
       </w:pPr>
-      <w:r/>
+      <w:r>
+        <w:t>Cover name and contact if needed</w:t>
+      </w:r>
+    </w:p>
+    <w:tbl>
+      <w:tblPr>
+        <w:tblW w:type="auto" w:w="0"/>
+        <w:jc w:val="left"/>
+        <w:tblLayout w:type="fixed"/>
+        <w:tblLook w:firstColumn="1" w:firstRow="1" w:lastColumn="0" w:lastRow="0" w:noHBand="0" w:noVBand="1" w:val="04A0"/>
+      </w:tblPr>
+      <w:tblGrid>
+        <w:gridCol w:w="10205"/>
+      </w:tblGrid>
+      <w:tr>
+        <w:trPr>
+          <w:trHeight w:val="1000" w:hRule="atLeast"/>
+        </w:trPr>
+        <w:tc>
+          <w:tcPr>
+            <w:tcW w:type="dxa" w:w="10206"/>
+            <w:vAlign w:val="top"/>
+            <w:shd w:fill="FFFFFF"/>
+            <w:tcBorders>
+              <w:top w:val="single" w:sz="6" w:color="71838D"/>
+              <w:left w:val="single" w:sz="6" w:color="71838D"/>
+              <w:bottom w:val="single" w:sz="6" w:color="71838D"/>
+              <w:right w:val="single" w:sz="6" w:color="71838D"/>
+            </w:tcBorders>
+            <w:tcMar>
+              <w:top w:w="115" w:type="dxa"/>
+              <w:bottom w:w="115" w:type="dxa"/>
+              <w:left w:w="115" w:type="dxa"/>
+              <w:right w:w="115" w:type="dxa"/>
+            </w:tcMar>
+          </w:tcPr>
+          <w:sdt>
+            <w:sdtPr>
+              <w:alias w:val="Cover name and contact if needed"/>
+              <w:tag w:val="cover_contact"/>
+              <w:id w:val="103"/>
+              <w:text w:multiLine="1"/>
+            </w:sdtPr>
+            <w:sdtContent>
+              <w:p>
+                <w:pPr>
+                  <w:pStyle w:val="Answer"/>
+                </w:pPr>
+                <w:r>
+                  <w:rPr>
+                    <w:rFonts w:ascii="Frutiger LT Com 45 Light" w:hAnsi="Frutiger LT Com 45 Light"/>
+                    <w:sz w:val="28"/>
+                  </w:rPr>
+                  <w:t xml:space="preserve"> </w:t>
+                </w:r>
+              </w:p>
+            </w:sdtContent>
+          </w:sdt>
+        </w:tc>
+      </w:tr>
+    </w:tbl>
+    <w:p>
+      <w:pPr>
+        <w:spacing w:after="0" w:before="0" w:line="60" w:lineRule="exact"/>
+      </w:pPr>
       <w:r>
         <w:rPr>
-          <w:b/>
+          <w:sz w:val="2"/>
         </w:rPr>
-        <w:t xml:space="preserve">Cover if needed  </w:t>
       </w:r>
-      <w:sdt>
-        <w:sdtPr>
-          <w:alias w:val="Cover if needed"/>
-          <w:tag w:val="handover_1004"/>
-          <w:id w:val="1004"/>
-          <w:text w:multiLine="1"/>
-        </w:sdtPr>
-        <w:sdtContent>
-          <w:r>
-            <w:rPr>
-              <w:rFonts w:ascii="Arial" w:hAnsi="Arial"/>
-              <w:sz w:val="22"/>
-              <w:color w:val="47545B"/>
-              <w:shd w:fill="F2F5F6" w:val="clear"/>
-            </w:rPr>
-            <w:t xml:space="preserve">Name and contact route</w:t>
-          </w:r>
-        </w:sdtContent>
-      </w:sdt>
     </w:p>
     <w:p>
       <w:pPr>
-        <w:keepNext w:val="0"/>
+        <w:spacing w:after="100"/>
       </w:pPr>
       <w:r>
         <w:rPr>
-          <w:sz w:val="19"/>
+          <w:sz w:val="27"/>
         </w:rPr>
         <w:t>Check the caller can open the offer form and use the agreed safe contact and communication arrangements.</w:t>
       </w:r>
     </w:p>
     <w:p>
       <w:pPr>
-        <w:pStyle w:val="Heading2"/>
-        <w:keepNext/>
+        <w:pStyle w:val="Heading1"/>
+        <w:pageBreakBefore w:val="0"/>
+        <w:spacing w:after="140"/>
       </w:pPr>
       <w:r>
-        <w:t>2 Give the caller the help routes</w:t>
-      </w:r>
-    </w:p>
-    <w:p>
-      <w:pPr>
-        <w:keepNext w:val="0"/>
-      </w:pPr>
-      <w:r/>
-      <w:r>
-        <w:rPr>
-          <w:b/>
-        </w:rPr>
-        <w:t xml:space="preserve">Clinical or safeguarding help  </w:t>
-      </w:r>
-      <w:sdt>
-        <w:sdtPr>
-          <w:alias w:val="Clinical or safeguarding help"/>
-          <w:tag w:val="handover_1005"/>
-          <w:id w:val="1005"/>
-          <w:text w:multiLine="1"/>
-        </w:sdtPr>
-        <w:sdtContent>
-          <w:r>
-            <w:rPr>
-              <w:rFonts w:ascii="Arial" w:hAnsi="Arial"/>
-              <w:sz w:val="22"/>
-              <w:color w:val="47545B"/>
-              <w:shd w:fill="F2F5F6" w:val="clear"/>
-            </w:rPr>
-            <w:t xml:space="preserve">Team and contact route</w:t>
-          </w:r>
-        </w:sdtContent>
-      </w:sdt>
-    </w:p>
-    <w:p>
-      <w:pPr>
-        <w:keepNext w:val="0"/>
-      </w:pPr>
-      <w:r/>
-      <w:r>
-        <w:rPr>
-          <w:b/>
-        </w:rPr>
-        <w:t xml:space="preserve">Backup if no response  </w:t>
-      </w:r>
-      <w:sdt>
-        <w:sdtPr>
-          <w:alias w:val="Backup if no response"/>
-          <w:tag w:val="handover_1006"/>
-          <w:id w:val="1006"/>
-          <w:text w:multiLine="1"/>
-        </w:sdtPr>
-        <w:sdtContent>
-          <w:r>
-            <w:rPr>
-              <w:rFonts w:ascii="Arial" w:hAnsi="Arial"/>
-              <w:sz w:val="22"/>
-              <w:color w:val="47545B"/>
-              <w:shd w:fill="F2F5F6" w:val="clear"/>
-            </w:rPr>
-            <w:t xml:space="preserve">Team and contact route</w:t>
-          </w:r>
-        </w:sdtContent>
-      </w:sdt>
-    </w:p>
-    <w:p>
-      <w:pPr>
-        <w:keepNext/>
-      </w:pPr>
-      <w:r>
-        <w:rPr>
-          <w:b/>
-        </w:rPr>
-        <w:t>Identity check and no answer plan</w:t>
-      </w:r>
-    </w:p>
-    <w:p>
-      <w:pPr>
-        <w:keepNext w:val="0"/>
-        <w:keepLines/>
-        <w:spacing w:after="100"/>
-        <w:shd w:fill="F2F5F6" w:val="clear"/>
-      </w:pPr>
-      <w:r/>
-      <w:sdt>
-        <w:sdtPr>
-          <w:alias w:val="Identity check and no answer plan"/>
-          <w:tag w:val="handover_1007"/>
-          <w:id w:val="1007"/>
-          <w:text w:multiLine="1"/>
-        </w:sdtPr>
-        <w:sdtContent>
-          <w:r>
-            <w:rPr>
-              <w:rFonts w:ascii="Arial" w:hAnsi="Arial"/>
-              <w:sz w:val="22"/>
-              <w:color w:val="47545B"/>
-              <w:shd w:fill="F2F5F6" w:val="clear"/>
-            </w:rPr>
-            <w:t xml:space="preserve">Local instructions or where to find them</w:t>
-            <w:br/>
-            <w:t> </w:t>
-          </w:r>
-        </w:sdtContent>
-      </w:sdt>
-    </w:p>
-    <w:p>
-      <w:pPr>
-        <w:keepNext w:val="0"/>
-      </w:pPr>
-      <w:r>
-        <w:rPr>
-          <w:sz w:val="19"/>
-        </w:rPr>
-        <w:t>Use the voicemail choice in the offer form. No answer does not confirm safety.</w:t>
-      </w:r>
-    </w:p>
-    <w:p>
-      <w:pPr>
-        <w:keepNext w:val="0"/>
-      </w:pPr>
-      <w:r/>
-      <w:r>
-        <w:rPr>
-          <w:b/>
-        </w:rPr>
-        <w:t xml:space="preserve">Where to save the call form  </w:t>
-      </w:r>
-      <w:sdt>
-        <w:sdtPr>
-          <w:alias w:val="Where to save the call form"/>
-          <w:tag w:val="handover_1008"/>
-          <w:id w:val="1008"/>
-          <w:text w:multiLine="1"/>
-        </w:sdtPr>
-        <w:sdtContent>
-          <w:r>
-            <w:rPr>
-              <w:rFonts w:ascii="Arial" w:hAnsi="Arial"/>
-              <w:sz w:val="22"/>
-              <w:color w:val="47545B"/>
-              <w:shd w:fill="F2F5F6" w:val="clear"/>
-            </w:rPr>
-            <w:t xml:space="preserve">SystmOne record; for a carer, their agreed record</w:t>
-          </w:r>
-        </w:sdtContent>
-      </w:sdt>
-    </w:p>
-    <w:p>
-      <w:pPr>
-        <w:keepNext w:val="0"/>
-      </w:pPr>
-      <w:r/>
-      <w:r>
-        <w:rPr>
-          <w:b/>
-        </w:rPr>
-        <w:t xml:space="preserve">Who reviews agreed project feedback?  </w:t>
-      </w:r>
-      <w:sdt>
-        <w:sdtPr>
-          <w:alias w:val="Who reviews agreed project feedback?"/>
-          <w:tag w:val="handover_1009"/>
-          <w:id w:val="1009"/>
-          <w:text w:multiLine="1"/>
-        </w:sdtPr>
-        <w:sdtContent>
-          <w:r>
-            <w:rPr>
-              <w:rFonts w:ascii="Arial" w:hAnsi="Arial"/>
-              <w:sz w:val="22"/>
-              <w:color w:val="47545B"/>
-              <w:shd w:fill="F2F5F6" w:val="clear"/>
-            </w:rPr>
-            <w:t xml:space="preserve">Authorised reviewer and secure access to the record</w:t>
-          </w:r>
-        </w:sdtContent>
-      </w:sdt>
-    </w:p>
-    <w:p>
-      <w:pPr>
-        <w:keepNext w:val="0"/>
-      </w:pPr>
-      <w:r>
-        <w:rPr>
-          <w:sz w:val="19"/>
-        </w:rPr>
-        <w:t>Feedback is inside the call form. Arrange review of that record; the caller does not complete another feedback form.</w:t>
+        <w:t>2 Give the help routes</w:t>
       </w:r>
     </w:p>
     <w:p>
       <w:pPr>
         <w:pStyle w:val="Heading2"/>
-        <w:keepNext/>
+        <w:spacing w:after="120"/>
+      </w:pPr>
+      <w:r>
+        <w:t>Clinical or safeguarding team and contact</w:t>
+      </w:r>
+    </w:p>
+    <w:tbl>
+      <w:tblPr>
+        <w:tblW w:type="auto" w:w="0"/>
+        <w:jc w:val="left"/>
+        <w:tblLayout w:type="fixed"/>
+        <w:tblLook w:firstColumn="1" w:firstRow="1" w:lastColumn="0" w:lastRow="0" w:noHBand="0" w:noVBand="1" w:val="04A0"/>
+      </w:tblPr>
+      <w:tblGrid>
+        <w:gridCol w:w="10205"/>
+      </w:tblGrid>
+      <w:tr>
+        <w:trPr>
+          <w:trHeight w:val="1100" w:hRule="atLeast"/>
+        </w:trPr>
+        <w:tc>
+          <w:tcPr>
+            <w:tcW w:type="dxa" w:w="10206"/>
+            <w:vAlign w:val="top"/>
+            <w:shd w:fill="FFFFFF"/>
+            <w:tcBorders>
+              <w:top w:val="single" w:sz="6" w:color="71838D"/>
+              <w:left w:val="single" w:sz="6" w:color="71838D"/>
+              <w:bottom w:val="single" w:sz="6" w:color="71838D"/>
+              <w:right w:val="single" w:sz="6" w:color="71838D"/>
+            </w:tcBorders>
+            <w:tcMar>
+              <w:top w:w="115" w:type="dxa"/>
+              <w:bottom w:w="115" w:type="dxa"/>
+              <w:left w:w="115" w:type="dxa"/>
+              <w:right w:w="115" w:type="dxa"/>
+            </w:tcMar>
+          </w:tcPr>
+          <w:sdt>
+            <w:sdtPr>
+              <w:alias w:val="Clinical or safeguarding team and contact"/>
+              <w:tag w:val="clinical_help"/>
+              <w:id w:val="104"/>
+              <w:text w:multiLine="1"/>
+            </w:sdtPr>
+            <w:sdtContent>
+              <w:p>
+                <w:pPr>
+                  <w:pStyle w:val="Answer"/>
+                </w:pPr>
+                <w:r>
+                  <w:rPr>
+                    <w:rFonts w:ascii="Frutiger LT Com 45 Light" w:hAnsi="Frutiger LT Com 45 Light"/>
+                    <w:sz w:val="28"/>
+                  </w:rPr>
+                  <w:t xml:space="preserve"> </w:t>
+                </w:r>
+              </w:p>
+            </w:sdtContent>
+          </w:sdt>
+        </w:tc>
+      </w:tr>
+    </w:tbl>
+    <w:p>
+      <w:pPr>
+        <w:spacing w:after="0" w:before="0" w:line="60" w:lineRule="exact"/>
+      </w:pPr>
+      <w:r>
+        <w:rPr>
+          <w:sz w:val="2"/>
+        </w:rPr>
+      </w:r>
+    </w:p>
+    <w:p>
+      <w:pPr>
+        <w:pStyle w:val="Heading2"/>
+        <w:spacing w:after="120"/>
+      </w:pPr>
+      <w:r>
+        <w:t>Backup contact if no response</w:t>
+      </w:r>
+    </w:p>
+    <w:tbl>
+      <w:tblPr>
+        <w:tblW w:type="auto" w:w="0"/>
+        <w:jc w:val="left"/>
+        <w:tblLayout w:type="fixed"/>
+        <w:tblLook w:firstColumn="1" w:firstRow="1" w:lastColumn="0" w:lastRow="0" w:noHBand="0" w:noVBand="1" w:val="04A0"/>
+      </w:tblPr>
+      <w:tblGrid>
+        <w:gridCol w:w="10205"/>
+      </w:tblGrid>
+      <w:tr>
+        <w:trPr>
+          <w:trHeight w:val="1100" w:hRule="atLeast"/>
+        </w:trPr>
+        <w:tc>
+          <w:tcPr>
+            <w:tcW w:type="dxa" w:w="10206"/>
+            <w:vAlign w:val="top"/>
+            <w:shd w:fill="FFFFFF"/>
+            <w:tcBorders>
+              <w:top w:val="single" w:sz="6" w:color="71838D"/>
+              <w:left w:val="single" w:sz="6" w:color="71838D"/>
+              <w:bottom w:val="single" w:sz="6" w:color="71838D"/>
+              <w:right w:val="single" w:sz="6" w:color="71838D"/>
+            </w:tcBorders>
+            <w:tcMar>
+              <w:top w:w="115" w:type="dxa"/>
+              <w:bottom w:w="115" w:type="dxa"/>
+              <w:left w:w="115" w:type="dxa"/>
+              <w:right w:w="115" w:type="dxa"/>
+            </w:tcMar>
+          </w:tcPr>
+          <w:sdt>
+            <w:sdtPr>
+              <w:alias w:val="Backup contact if no response"/>
+              <w:tag w:val="backup_help"/>
+              <w:id w:val="105"/>
+              <w:text w:multiLine="1"/>
+            </w:sdtPr>
+            <w:sdtContent>
+              <w:p>
+                <w:pPr>
+                  <w:pStyle w:val="Answer"/>
+                </w:pPr>
+                <w:r>
+                  <w:rPr>
+                    <w:rFonts w:ascii="Frutiger LT Com 45 Light" w:hAnsi="Frutiger LT Com 45 Light"/>
+                    <w:sz w:val="28"/>
+                  </w:rPr>
+                  <w:t xml:space="preserve"> </w:t>
+                </w:r>
+              </w:p>
+            </w:sdtContent>
+          </w:sdt>
+        </w:tc>
+      </w:tr>
+    </w:tbl>
+    <w:p>
+      <w:pPr>
+        <w:spacing w:after="0" w:before="0" w:line="60" w:lineRule="exact"/>
+      </w:pPr>
+      <w:r>
+        <w:rPr>
+          <w:sz w:val="2"/>
+        </w:rPr>
+      </w:r>
+    </w:p>
+    <w:p>
+      <w:pPr>
+        <w:pStyle w:val="Heading1"/>
+        <w:pageBreakBefore/>
+        <w:spacing w:after="140"/>
+      </w:pPr>
+      <w:r>
+        <w:t>2 Give the help routes continued</w:t>
+      </w:r>
+    </w:p>
+    <w:p>
+      <w:pPr>
+        <w:pStyle w:val="Heading2"/>
+        <w:spacing w:after="120"/>
+      </w:pPr>
+      <w:r>
+        <w:t>Identity check and no answer plan</w:t>
+      </w:r>
+    </w:p>
+    <w:tbl>
+      <w:tblPr>
+        <w:tblW w:type="auto" w:w="0"/>
+        <w:jc w:val="left"/>
+        <w:tblLayout w:type="fixed"/>
+        <w:tblLook w:firstColumn="1" w:firstRow="1" w:lastColumn="0" w:lastRow="0" w:noHBand="0" w:noVBand="1" w:val="04A0"/>
+      </w:tblPr>
+      <w:tblGrid>
+        <w:gridCol w:w="10205"/>
+      </w:tblGrid>
+      <w:tr>
+        <w:trPr>
+          <w:trHeight w:val="1600" w:hRule="atLeast"/>
+        </w:trPr>
+        <w:tc>
+          <w:tcPr>
+            <w:tcW w:type="dxa" w:w="10206"/>
+            <w:vAlign w:val="top"/>
+            <w:shd w:fill="FFFFFF"/>
+            <w:tcBorders>
+              <w:top w:val="single" w:sz="6" w:color="71838D"/>
+              <w:left w:val="single" w:sz="6" w:color="71838D"/>
+              <w:bottom w:val="single" w:sz="6" w:color="71838D"/>
+              <w:right w:val="single" w:sz="6" w:color="71838D"/>
+            </w:tcBorders>
+            <w:tcMar>
+              <w:top w:w="115" w:type="dxa"/>
+              <w:bottom w:w="115" w:type="dxa"/>
+              <w:left w:w="115" w:type="dxa"/>
+              <w:right w:w="115" w:type="dxa"/>
+            </w:tcMar>
+          </w:tcPr>
+          <w:sdt>
+            <w:sdtPr>
+              <w:alias w:val="Identity check and no answer plan"/>
+              <w:tag w:val="identity_and_no_answer"/>
+              <w:id w:val="106"/>
+              <w:text w:multiLine="1"/>
+            </w:sdtPr>
+            <w:sdtContent>
+              <w:p>
+                <w:pPr>
+                  <w:pStyle w:val="Answer"/>
+                </w:pPr>
+                <w:r>
+                  <w:rPr>
+                    <w:rFonts w:ascii="Frutiger LT Com 45 Light" w:hAnsi="Frutiger LT Com 45 Light"/>
+                    <w:sz w:val="28"/>
+                  </w:rPr>
+                  <w:t xml:space="preserve"> </w:t>
+                </w:r>
+              </w:p>
+            </w:sdtContent>
+          </w:sdt>
+        </w:tc>
+      </w:tr>
+    </w:tbl>
+    <w:p>
+      <w:pPr>
+        <w:spacing w:after="0" w:before="0" w:line="60" w:lineRule="exact"/>
+      </w:pPr>
+      <w:r>
+        <w:rPr>
+          <w:sz w:val="2"/>
+        </w:rPr>
+      </w:r>
+    </w:p>
+    <w:p>
+      <w:pPr>
+        <w:spacing w:after="120"/>
+      </w:pPr>
+      <w:r>
+        <w:rPr>
+          <w:sz w:val="27"/>
+        </w:rPr>
+        <w:t>Use the voicemail choice in the offer form.</w:t>
+        <w:br/>
+        <w:t>No answer does not confirm safety.</w:t>
+      </w:r>
+    </w:p>
+    <w:p>
+      <w:pPr>
+        <w:pStyle w:val="Heading2"/>
+        <w:spacing w:after="120"/>
+      </w:pPr>
+      <w:r>
+        <w:t>Where should the call form be saved?</w:t>
+      </w:r>
+    </w:p>
+    <w:tbl>
+      <w:tblPr>
+        <w:tblW w:type="auto" w:w="0"/>
+        <w:jc w:val="left"/>
+        <w:tblLayout w:type="fixed"/>
+        <w:tblLook w:firstColumn="1" w:firstRow="1" w:lastColumn="0" w:lastRow="0" w:noHBand="0" w:noVBand="1" w:val="04A0"/>
+      </w:tblPr>
+      <w:tblGrid>
+        <w:gridCol w:w="10205"/>
+      </w:tblGrid>
+      <w:tr>
+        <w:trPr>
+          <w:trHeight w:val="1100" w:hRule="atLeast"/>
+        </w:trPr>
+        <w:tc>
+          <w:tcPr>
+            <w:tcW w:type="dxa" w:w="10206"/>
+            <w:vAlign w:val="top"/>
+            <w:shd w:fill="FFFFFF"/>
+            <w:tcBorders>
+              <w:top w:val="single" w:sz="6" w:color="71838D"/>
+              <w:left w:val="single" w:sz="6" w:color="71838D"/>
+              <w:bottom w:val="single" w:sz="6" w:color="71838D"/>
+              <w:right w:val="single" w:sz="6" w:color="71838D"/>
+            </w:tcBorders>
+            <w:tcMar>
+              <w:top w:w="115" w:type="dxa"/>
+              <w:bottom w:w="115" w:type="dxa"/>
+              <w:left w:w="115" w:type="dxa"/>
+              <w:right w:w="115" w:type="dxa"/>
+            </w:tcMar>
+          </w:tcPr>
+          <w:sdt>
+            <w:sdtPr>
+              <w:alias w:val="Where should the call form be saved?"/>
+              <w:tag w:val="record_location"/>
+              <w:id w:val="107"/>
+              <w:text w:multiLine="1"/>
+            </w:sdtPr>
+            <w:sdtContent>
+              <w:p>
+                <w:pPr>
+                  <w:pStyle w:val="Answer"/>
+                </w:pPr>
+                <w:r>
+                  <w:rPr>
+                    <w:rFonts w:ascii="Frutiger LT Com 45 Light" w:hAnsi="Frutiger LT Com 45 Light"/>
+                    <w:sz w:val="28"/>
+                  </w:rPr>
+                  <w:t xml:space="preserve"> </w:t>
+                </w:r>
+              </w:p>
+            </w:sdtContent>
+          </w:sdt>
+        </w:tc>
+      </w:tr>
+    </w:tbl>
+    <w:p>
+      <w:pPr>
+        <w:spacing w:after="0" w:before="0" w:line="60" w:lineRule="exact"/>
+      </w:pPr>
+      <w:r>
+        <w:rPr>
+          <w:sz w:val="2"/>
+        </w:rPr>
+      </w:r>
+    </w:p>
+    <w:p>
+      <w:pPr>
+        <w:spacing w:after="120"/>
+      </w:pPr>
+      <w:r>
+        <w:rPr>
+          <w:sz w:val="27"/>
+        </w:rPr>
+        <w:t>Use the person’s SystmOne record. For a carer, use their own agreed record.</w:t>
+      </w:r>
+    </w:p>
+    <w:p>
+      <w:pPr>
+        <w:pStyle w:val="Heading2"/>
+        <w:spacing w:after="120"/>
+      </w:pPr>
+      <w:r>
+        <w:t>Who reviews the agreed project feedback?</w:t>
+      </w:r>
+    </w:p>
+    <w:tbl>
+      <w:tblPr>
+        <w:tblW w:type="auto" w:w="0"/>
+        <w:jc w:val="left"/>
+        <w:tblLayout w:type="fixed"/>
+        <w:tblLook w:firstColumn="1" w:firstRow="1" w:lastColumn="0" w:lastRow="0" w:noHBand="0" w:noVBand="1" w:val="04A0"/>
+      </w:tblPr>
+      <w:tblGrid>
+        <w:gridCol w:w="10205"/>
+      </w:tblGrid>
+      <w:tr>
+        <w:trPr>
+          <w:trHeight w:val="1100" w:hRule="atLeast"/>
+        </w:trPr>
+        <w:tc>
+          <w:tcPr>
+            <w:tcW w:type="dxa" w:w="10206"/>
+            <w:vAlign w:val="top"/>
+            <w:shd w:fill="FFFFFF"/>
+            <w:tcBorders>
+              <w:top w:val="single" w:sz="6" w:color="71838D"/>
+              <w:left w:val="single" w:sz="6" w:color="71838D"/>
+              <w:bottom w:val="single" w:sz="6" w:color="71838D"/>
+              <w:right w:val="single" w:sz="6" w:color="71838D"/>
+            </w:tcBorders>
+            <w:tcMar>
+              <w:top w:w="115" w:type="dxa"/>
+              <w:bottom w:w="115" w:type="dxa"/>
+              <w:left w:w="115" w:type="dxa"/>
+              <w:right w:w="115" w:type="dxa"/>
+            </w:tcMar>
+          </w:tcPr>
+          <w:sdt>
+            <w:sdtPr>
+              <w:alias w:val="Who reviews the agreed project feedback?"/>
+              <w:tag w:val="feedback_reviewer"/>
+              <w:id w:val="108"/>
+              <w:text w:multiLine="1"/>
+            </w:sdtPr>
+            <w:sdtContent>
+              <w:p>
+                <w:pPr>
+                  <w:pStyle w:val="Answer"/>
+                </w:pPr>
+                <w:r>
+                  <w:rPr>
+                    <w:rFonts w:ascii="Frutiger LT Com 45 Light" w:hAnsi="Frutiger LT Com 45 Light"/>
+                    <w:sz w:val="28"/>
+                  </w:rPr>
+                  <w:t xml:space="preserve"> </w:t>
+                </w:r>
+              </w:p>
+            </w:sdtContent>
+          </w:sdt>
+        </w:tc>
+      </w:tr>
+    </w:tbl>
+    <w:p>
+      <w:pPr>
+        <w:spacing w:after="0" w:before="0" w:line="60" w:lineRule="exact"/>
+      </w:pPr>
+      <w:r>
+        <w:rPr>
+          <w:sz w:val="2"/>
+        </w:rPr>
+      </w:r>
+    </w:p>
+    <w:p>
+      <w:pPr>
+        <w:spacing w:after="120"/>
+      </w:pPr>
+      <w:r>
+        <w:rPr>
+          <w:sz w:val="27"/>
+        </w:rPr>
+        <w:t>Name the authorised reviewer and their secure access to the record. Feedback stays in the call form. The caller does not complete another feedback form.</w:t>
+      </w:r>
+    </w:p>
+    <w:p>
+      <w:pPr>
+        <w:pStyle w:val="Heading1"/>
+        <w:pageBreakBefore w:val="0"/>
+        <w:spacing w:after="140"/>
       </w:pPr>
       <w:r>
         <w:t>3 Confirm the handover</w:t>
@@ -384,90 +809,162 @@
     </w:p>
     <w:p>
       <w:pPr>
-        <w:keepNext w:val="0"/>
-        <w:spacing w:after="60"/>
+        <w:spacing w:after="140"/>
       </w:pPr>
       <w:r/>
       <w:sdt>
         <w:sdtPr>
-          <w:alias w:val="Caller has accepted, can access the record and knows the contact and help plans."/>
-          <w:tag w:val="handover_1010"/>
-          <w:id w:val="1010"/>
+          <w:id w:val="109"/>
+          <w:alias w:val="Caller has accepted and can access the record."/>
+          <w:tag w:val="handover_accepted"/>
           <w14:checkbox>
             <w14:checked w14:val="0"/>
-            <w14:checkedState w14:val="2612" w14:font="Segoe UI Symbol"/>
-            <w14:uncheckedState w14:val="2610" w14:font="Segoe UI Symbol"/>
+            <w14:checkedState w14:val="2611" w14:font="DejaVu Sans"/>
+            <w14:uncheckedState w14:val="2610" w14:font="DejaVu Sans"/>
           </w14:checkbox>
         </w:sdtPr>
         <w:sdtContent>
           <w:r>
             <w:rPr>
-              <w:rFonts w:ascii="Arial" w:hAnsi="Arial"/>
-              <w:sz w:val="22"/>
+              <w:rFonts w:ascii="DejaVu Sans" w:hAnsi="DejaVu Sans" w:eastAsia="DejaVu Sans" w:cs="DejaVu Sans"/>
+              <w:sz w:val="28"/>
+              <w:color w:val="172C38"/>
+              <w:shd w:fill="FFFFFF"/>
             </w:rPr>
-            <w:t xml:space="preserve">☐</w:t>
+            <w:t>☐</w:t>
           </w:r>
         </w:sdtContent>
       </w:sdt>
       <w:r>
-        <w:t xml:space="preserve"> Caller has accepted, can access the record and knows the contact and help plans.</w:t>
+        <w:t xml:space="preserve"> Caller has accepted and can access the record.     </w:t>
       </w:r>
     </w:p>
     <w:p>
       <w:pPr>
-        <w:keepNext/>
+        <w:spacing w:after="140"/>
       </w:pPr>
+      <w:r/>
+      <w:sdt>
+        <w:sdtPr>
+          <w:id w:val="110"/>
+          <w:alias w:val="Caller knows the contact and help plans."/>
+          <w:tag w:val="plans_understood"/>
+          <w14:checkbox>
+            <w14:checked w14:val="0"/>
+            <w14:checkedState w14:val="2611" w14:font="DejaVu Sans"/>
+            <w14:uncheckedState w14:val="2610" w14:font="DejaVu Sans"/>
+          </w14:checkbox>
+        </w:sdtPr>
+        <w:sdtContent>
+          <w:r>
+            <w:rPr>
+              <w:rFonts w:ascii="DejaVu Sans" w:hAnsi="DejaVu Sans" w:eastAsia="DejaVu Sans" w:cs="DejaVu Sans"/>
+              <w:sz w:val="28"/>
+              <w:color w:val="172C38"/>
+              <w:shd w:fill="FFFFFF"/>
+            </w:rPr>
+            <w:t>☐</w:t>
+          </w:r>
+        </w:sdtContent>
+      </w:sdt>
       <w:r>
-        <w:rPr>
-          <w:b/>
-        </w:rPr>
-        <w:t>Anything still needed</w:t>
+        <w:t xml:space="preserve"> Caller knows the contact and help plans.     </w:t>
       </w:r>
     </w:p>
     <w:p>
       <w:pPr>
-        <w:keepNext w:val="0"/>
-        <w:keepLines/>
-        <w:spacing w:after="100"/>
-        <w:shd w:fill="F2F5F6" w:val="clear"/>
+        <w:pStyle w:val="Heading2"/>
+        <w:spacing w:after="120"/>
       </w:pPr>
-      <w:r/>
-      <w:sdt>
-        <w:sdtPr>
-          <w:alias w:val="Anything still needed"/>
-          <w:tag w:val="handover_1011"/>
-          <w:id w:val="1011"/>
-          <w:text w:multiLine="1"/>
-        </w:sdtPr>
-        <w:sdtContent>
-          <w:r>
-            <w:rPr>
-              <w:rFonts w:ascii="Arial" w:hAnsi="Arial"/>
-              <w:sz w:val="22"/>
-              <w:color w:val="47545B"/>
-              <w:shd w:fill="F2F5F6" w:val="clear"/>
-            </w:rPr>
-            <w:t xml:space="preserve">Action, who will do it and when; or Nothing outstanding</w:t>
-          </w:r>
-        </w:sdtContent>
-      </w:sdt>
+      <w:r>
+        <w:t>Anything still needed</w:t>
+      </w:r>
+    </w:p>
+    <w:tbl>
+      <w:tblPr>
+        <w:tblW w:type="auto" w:w="0"/>
+        <w:jc w:val="left"/>
+        <w:tblLayout w:type="fixed"/>
+        <w:tblLook w:firstColumn="1" w:firstRow="1" w:lastColumn="0" w:lastRow="0" w:noHBand="0" w:noVBand="1" w:val="04A0"/>
+      </w:tblPr>
+      <w:tblGrid>
+        <w:gridCol w:w="10205"/>
+      </w:tblGrid>
+      <w:tr>
+        <w:trPr>
+          <w:trHeight w:val="1100" w:hRule="atLeast"/>
+        </w:trPr>
+        <w:tc>
+          <w:tcPr>
+            <w:tcW w:type="dxa" w:w="10206"/>
+            <w:vAlign w:val="top"/>
+            <w:shd w:fill="FFFFFF"/>
+            <w:tcBorders>
+              <w:top w:val="single" w:sz="6" w:color="71838D"/>
+              <w:left w:val="single" w:sz="6" w:color="71838D"/>
+              <w:bottom w:val="single" w:sz="6" w:color="71838D"/>
+              <w:right w:val="single" w:sz="6" w:color="71838D"/>
+            </w:tcBorders>
+            <w:tcMar>
+              <w:top w:w="115" w:type="dxa"/>
+              <w:bottom w:w="115" w:type="dxa"/>
+              <w:left w:w="115" w:type="dxa"/>
+              <w:right w:w="115" w:type="dxa"/>
+            </w:tcMar>
+          </w:tcPr>
+          <w:sdt>
+            <w:sdtPr>
+              <w:alias w:val="Anything still needed"/>
+              <w:tag w:val="outstanding_actions"/>
+              <w:id w:val="111"/>
+              <w:text w:multiLine="1"/>
+            </w:sdtPr>
+            <w:sdtContent>
+              <w:p>
+                <w:pPr>
+                  <w:pStyle w:val="Answer"/>
+                </w:pPr>
+                <w:r>
+                  <w:rPr>
+                    <w:rFonts w:ascii="Frutiger LT Com 45 Light" w:hAnsi="Frutiger LT Com 45 Light"/>
+                    <w:sz w:val="28"/>
+                  </w:rPr>
+                  <w:t xml:space="preserve"> </w:t>
+                </w:r>
+              </w:p>
+            </w:sdtContent>
+          </w:sdt>
+        </w:tc>
+      </w:tr>
+    </w:tbl>
+    <w:p>
+      <w:pPr>
+        <w:spacing w:after="0" w:before="0" w:line="60" w:lineRule="exact"/>
+      </w:pPr>
+      <w:r>
+        <w:rPr>
+          <w:sz w:val="2"/>
+        </w:rPr>
+      </w:r>
     </w:p>
     <w:p>
       <w:pPr>
-        <w:keepNext w:val="0"/>
+        <w:spacing w:after="0"/>
       </w:pPr>
       <w:r>
         <w:rPr>
-          <w:sz w:val="19"/>
+          <w:sz w:val="27"/>
         </w:rPr>
-        <w:t>If checks are incomplete, resolve them before the call. Save this form in the agreed record.</w:t>
+        <w:t>Include the action, who will do it and when.</w:t>
+        <w:br/>
+        <w:t>Resolve incomplete checks before the call. Save in the agreed record.</w:t>
       </w:r>
     </w:p>
     <w:sectPr>
       <w:headerReference w:type="default" r:id="rId9"/>
       <w:footerReference w:type="default" r:id="rId10"/>
       <w:pgSz w:w="11906" w:h="16838"/>
-      <w:pgMar w:top="1502" w:right="1020" w:bottom="935" w:left="1020" w:header="369" w:footer="397" w:gutter="0"/>
+      <w:pgMar w:top="964" w:right="850" w:bottom="907" w:left="850" w:header="397" w:footer="397" w:gutter="0"/>
       <w:cols w:space="720"/>
       <w:docGrid w:linePitch="360"/>
     </w:sectPr>
@@ -480,14 +977,59 @@
   <w:p>
     <w:pPr>
       <w:pStyle w:val="Footer"/>
+      <w:tabs>
+        <w:tab w:pos="10205" w:val="right"/>
+      </w:tabs>
       <w:spacing w:after="0"/>
     </w:pPr>
     <w:r>
-      <w:t xml:space="preserve">Staff forms · Version 12 · 25 October 2026   |   Page </w:t>
+      <w:rPr>
+        <w:rFonts w:ascii="Frutiger LT Com 45 Light" w:hAnsi="Frutiger LT Com 45 Light"/>
+        <w:sz w:val="20"/>
+      </w:rPr>
+      <w:t>Discharge Project</w:t>
+    </w:r>
+    <w:r>
+      <w:rPr>
+        <w:rFonts w:ascii="Frutiger LT Com 45 Light" w:hAnsi="Frutiger LT Com 45 Light"/>
+        <w:sz w:val="20"/>
+      </w:rPr>
+      <w:tab/>
+      <w:t xml:space="preserve">Page </w:t>
     </w:r>
     <w:fldSimple w:instr="PAGE">
-      <w:r/>
+      <w:r>
+        <w:rPr>
+          <w:rFonts w:ascii="Frutiger LT Com 45 Light" w:hAnsi="Frutiger LT Com 45 Light" w:eastAsia="Frutiger LT Com 45 Light" w:cs="Frutiger LT Com 45 Light"/>
+          <w:sz w:val="20"/>
+          <w:color w:val="172C38"/>
+        </w:rPr>
+        <w:t>1</w:t>
+      </w:r>
     </w:fldSimple>
+    <w:r>
+      <w:rPr>
+        <w:rFonts w:ascii="Frutiger LT Com 45 Light" w:hAnsi="Frutiger LT Com 45 Light"/>
+        <w:sz w:val="20"/>
+      </w:rPr>
+      <w:t xml:space="preserve"> of </w:t>
+    </w:r>
+    <w:fldSimple w:instr="NUMPAGES">
+      <w:r>
+        <w:rPr>
+          <w:rFonts w:ascii="Frutiger LT Com 45 Light" w:hAnsi="Frutiger LT Com 45 Light" w:eastAsia="Frutiger LT Com 45 Light" w:cs="Frutiger LT Com 45 Light"/>
+          <w:sz w:val="20"/>
+          <w:color w:val="172C38"/>
+        </w:rPr>
+        <w:t>1</w:t>
+      </w:r>
+    </w:fldSimple>
+    <w:r>
+      <w:rPr>
+        <w:rFonts w:ascii="Frutiger LT Com 45 Light" w:hAnsi="Frutiger LT Com 45 Light"/>
+        <w:sz w:val="20"/>
+      </w:rPr>
+    </w:r>
   </w:p>
 </w:ftr>
 </file>
@@ -497,174 +1039,17 @@
   <w:p>
     <w:pPr>
       <w:pStyle w:val="Header"/>
-      <w:spacing w:after="0" w:line="240" w:lineRule="auto" w:before="0"/>
+      <w:spacing w:after="0"/>
     </w:pPr>
     <w:r>
       <w:rPr>
-        <w:sz w:val="2"/>
-      </w:rPr>
+        <w:rFonts w:ascii="Frutiger LT Com 45 Light" w:hAnsi="Frutiger LT Com 45 Light"/>
+        <w:color w:val="314C59"/>
+        <w:sz w:val="22"/>
+      </w:rPr>
+      <w:t>CNWL  |  Lived Experience Workforce</w:t>
     </w:r>
   </w:p>
-  <w:tbl>
-    <w:tblPr>
-      <w:tblW w:type="auto" w:w="0"/>
-      <w:tblLayout w:type="fixed"/>
-      <w:tblLook w:firstColumn="1" w:firstRow="1" w:lastColumn="0" w:lastRow="0" w:noHBand="0" w:noVBand="1" w:val="04A0"/>
-      <w:tblBorders>
-        <w:top w:val="nil"/>
-        <w:left w:val="nil"/>
-        <w:bottom w:val="nil"/>
-        <w:right w:val="nil"/>
-        <w:insideH w:val="nil"/>
-        <w:insideV w:val="nil"/>
-      </w:tblBorders>
-    </w:tblPr>
-    <w:tblGrid>
-      <w:gridCol w:w="1616"/>
-      <w:gridCol w:w="7115"/>
-      <w:gridCol w:w="1134"/>
-    </w:tblGrid>
-    <w:tr>
-      <w:tc>
-        <w:tcPr>
-          <w:tcW w:type="dxa" w:w="1616"/>
-          <w:vAlign w:val="center"/>
-          <w:tcMar>
-            <w:top w:w="40" w:type="dxa"/>
-            <w:bottom w:w="40" w:type="dxa"/>
-            <w:left w:w="70" w:type="dxa"/>
-            <w:right w:w="70" w:type="dxa"/>
-          </w:tcMar>
-          <w:shd w:fill="005EB8"/>
-        </w:tcPr>
-        <w:p>
-          <w:pPr>
-            <w:spacing w:after="0" w:line="240" w:lineRule="auto"/>
-            <w:jc w:val="center"/>
-          </w:pPr>
-          <w:r>
-            <w:drawing>
-              <wp:inline xmlns:a="http://schemas.openxmlformats.org/drawingml/2006/main" xmlns:pic="http://schemas.openxmlformats.org/drawingml/2006/picture">
-                <wp:extent cx="827999" cy="403200"/>
-                <wp:docPr id="1" name="Picture 1" descr="Central and North West London NHS Foundation Trust"/>
-                <wp:cNvGraphicFramePr>
-                  <a:graphicFrameLocks noChangeAspect="1"/>
-                </wp:cNvGraphicFramePr>
-                <a:graphic>
-                  <a:graphicData uri="http://schemas.openxmlformats.org/drawingml/2006/picture">
-                    <pic:pic>
-                      <pic:nvPicPr>
-                        <pic:cNvPr id="0" name="CNWL_Logo.png"/>
-                        <pic:cNvPicPr/>
-                      </pic:nvPicPr>
-                      <pic:blipFill>
-                        <a:blip r:embed="rId1"/>
-                        <a:stretch>
-                          <a:fillRect/>
-                        </a:stretch>
-                      </pic:blipFill>
-                      <pic:spPr>
-                        <a:xfrm>
-                          <a:off x="0" y="0"/>
-                          <a:ext cx="827999" cy="403200"/>
-                        </a:xfrm>
-                        <a:prstGeom prst="rect"/>
-                      </pic:spPr>
-                    </pic:pic>
-                  </a:graphicData>
-                </a:graphic>
-              </wp:inline>
-            </w:drawing>
-          </w:r>
-        </w:p>
-      </w:tc>
-      <w:tc>
-        <w:tcPr>
-          <w:tcW w:type="dxa" w:w="7115"/>
-          <w:vAlign w:val="center"/>
-          <w:tcMar>
-            <w:top w:w="40" w:type="dxa"/>
-            <w:bottom w:w="40" w:type="dxa"/>
-            <w:left w:w="70" w:type="dxa"/>
-            <w:right w:w="70" w:type="dxa"/>
-          </w:tcMar>
-        </w:tcPr>
-        <w:p>
-          <w:pPr>
-            <w:spacing w:after="0" w:line="240" w:lineRule="auto"/>
-          </w:pPr>
-          <w:r>
-            <w:rPr>
-              <w:b/>
-              <w:sz w:val="20"/>
-            </w:rPr>
-            <w:t>Lived Experience Discharge</w:t>
-            <w:br/>
-            <w:t>and Transition Project</w:t>
-          </w:r>
-          <w:r>
-            <w:rPr>
-              <w:sz w:val="17"/>
-            </w:rPr>
-            <w:br/>
-            <w:t>CNWL Peer and Lived Experience Workforce</w:t>
-          </w:r>
-        </w:p>
-      </w:tc>
-      <w:tc>
-        <w:tcPr>
-          <w:tcW w:type="dxa" w:w="1134"/>
-          <w:vAlign w:val="center"/>
-          <w:tcMar>
-            <w:top w:w="40" w:type="dxa"/>
-            <w:bottom w:w="40" w:type="dxa"/>
-            <w:left w:w="70" w:type="dxa"/>
-            <w:right w:w="70" w:type="dxa"/>
-          </w:tcMar>
-        </w:tcPr>
-        <w:p>
-          <w:pPr>
-            <w:spacing w:after="0" w:line="240" w:lineRule="auto"/>
-            <w:jc w:val="right"/>
-          </w:pPr>
-          <w:r>
-            <w:drawing>
-              <wp:inline xmlns:a="http://schemas.openxmlformats.org/drawingml/2006/main" xmlns:pic="http://schemas.openxmlformats.org/drawingml/2006/picture">
-                <wp:extent cx="483290" cy="450000"/>
-                <wp:docPr id="2" name="Picture 2" descr="CNWL Peer and Lived Experience Workforce"/>
-                <wp:cNvGraphicFramePr>
-                  <a:graphicFrameLocks noChangeAspect="1"/>
-                </wp:cNvGraphicFramePr>
-                <a:graphic>
-                  <a:graphicData uri="http://schemas.openxmlformats.org/drawingml/2006/picture">
-                    <pic:pic>
-                      <pic:nvPicPr>
-                        <pic:cNvPr id="0" name="Lived_Experience_Logo.png"/>
-                        <pic:cNvPicPr/>
-                      </pic:nvPicPr>
-                      <pic:blipFill>
-                        <a:blip r:embed="rId2"/>
-                        <a:stretch>
-                          <a:fillRect/>
-                        </a:stretch>
-                      </pic:blipFill>
-                      <pic:spPr>
-                        <a:xfrm>
-                          <a:off x="0" y="0"/>
-                          <a:ext cx="483290" cy="450000"/>
-                        </a:xfrm>
-                        <a:prstGeom prst="rect"/>
-                      </pic:spPr>
-                    </pic:pic>
-                  </a:graphicData>
-                </a:graphic>
-              </wp:inline>
-            </w:drawing>
-          </w:r>
-        </w:p>
-      </w:tc>
-    </w:tr>
-  </w:tbl>
 </w:hdr>
 </file>
 
@@ -1032,12 +1417,13 @@
     <w:qFormat/>
     <w:rsid w:val="00FC693F"/>
     <w:pPr>
-      <w:spacing w:before="0" w:after="80" w:line="250" w:lineRule="auto"/>
+      <w:widowControl/>
+      <w:spacing w:line="269" w:lineRule="auto" w:after="100"/>
     </w:pPr>
     <w:rPr>
-      <w:rFonts w:ascii="Arial" w:hAnsi="Arial"/>
-      <w:color w:val="000000"/>
-      <w:sz w:val="22"/>
+      <w:rFonts w:ascii="Frutiger LT Com 45 Light" w:hAnsi="Frutiger LT Com 45 Light" w:eastAsia="Frutiger LT Com 45 Light" w:cs="Frutiger LT Com 45 Light"/>
+      <w:sz w:val="28"/>
+      <w:color w:val="172C38"/>
     </w:rPr>
   </w:style>
   <w:style w:type="paragraph" w:styleId="Header">
@@ -1052,13 +1438,8 @@
         <w:tab w:val="center" w:pos="4680"/>
         <w:tab w:val="right" w:pos="9360"/>
       </w:tabs>
-      <w:spacing w:after="80" w:line="254" w:lineRule="auto" w:before="0"/>
-    </w:pPr>
-    <w:rPr>
-      <w:rFonts w:ascii="Arial" w:hAnsi="Arial"/>
-      <w:color w:val="000000"/>
-      <w:sz w:val="18"/>
-    </w:rPr>
+      <w:spacing w:after="0" w:line="240" w:lineRule="auto"/>
+    </w:pPr>
   </w:style>
   <w:style w:type="character" w:customStyle="1" w:styleId="HeaderChar">
     <w:name w:val="Header Char"/>
@@ -1075,17 +1456,8 @@
     <w:unhideWhenUsed/>
     <w:rsid w:val="00E618BF"/>
     <w:pPr>
-      <w:tabs>
-        <w:tab w:val="center" w:pos="4680"/>
-        <w:tab w:val="right" w:pos="9360"/>
-      </w:tabs>
-      <w:spacing w:after="80" w:line="254" w:lineRule="auto" w:before="0"/>
-    </w:pPr>
-    <w:rPr>
-      <w:rFonts w:ascii="Arial" w:hAnsi="Arial"/>
-      <w:color w:val="000000"/>
-      <w:sz w:val="18"/>
-    </w:rPr>
+      <w:spacing w:after="0" w:line="240" w:lineRule="auto"/>
+    </w:pPr>
   </w:style>
   <w:style w:type="character" w:customStyle="1" w:styleId="FooterChar">
     <w:name w:val="Footer Char"/>
@@ -1105,16 +1477,16 @@
     <w:pPr>
       <w:keepNext/>
       <w:keepLines/>
-      <w:spacing w:before="0" w:after="80" w:line="254" w:lineRule="auto"/>
+      <w:spacing w:before="200" w:after="140"/>
       <w:outlineLvl w:val="0"/>
     </w:pPr>
     <w:rPr>
-      <w:rFonts w:asciiTheme="majorHAnsi" w:eastAsiaTheme="majorEastAsia" w:hAnsiTheme="majorHAnsi" w:cstheme="majorBidi" w:ascii="Arial" w:hAnsi="Arial"/>
+      <w:bCs/>
+      <w:szCs w:val="28"/>
+      <w:rFonts w:ascii="Frutiger LT Com 45 Light" w:hAnsi="Frutiger LT Com 45 Light" w:eastAsia="Frutiger LT Com 45 Light" w:cs="Frutiger LT Com 45 Light"/>
+      <w:sz w:val="48"/>
+      <w:color w:val="000000"/>
       <w:b/>
-      <w:bCs/>
-      <w:color w:val="000000"/>
-      <w:sz w:val="36"/>
-      <w:szCs w:val="28"/>
     </w:rPr>
   </w:style>
   <w:style w:type="paragraph" w:styleId="Heading2">
@@ -1129,16 +1501,16 @@
     <w:pPr>
       <w:keepNext/>
       <w:keepLines/>
-      <w:spacing w:before="160" w:after="80" w:line="254" w:lineRule="auto"/>
+      <w:spacing w:before="200" w:after="140"/>
       <w:outlineLvl w:val="1"/>
     </w:pPr>
     <w:rPr>
-      <w:rFonts w:asciiTheme="majorHAnsi" w:eastAsiaTheme="majorEastAsia" w:hAnsiTheme="majorHAnsi" w:cstheme="majorBidi" w:ascii="Arial" w:hAnsi="Arial"/>
+      <w:bCs/>
+      <w:szCs w:val="26"/>
+      <w:rFonts w:ascii="Frutiger LT Com 45 Light" w:hAnsi="Frutiger LT Com 45 Light" w:eastAsia="Frutiger LT Com 45 Light" w:cs="Frutiger LT Com 45 Light"/>
+      <w:sz w:val="32"/>
+      <w:color w:val="000000"/>
       <w:b/>
-      <w:bCs/>
-      <w:color w:val="000000"/>
-      <w:sz w:val="24"/>
-      <w:szCs w:val="26"/>
     </w:rPr>
   </w:style>
   <w:style w:type="paragraph" w:styleId="Heading3">
@@ -1153,15 +1525,14 @@
     <w:pPr>
       <w:keepNext/>
       <w:keepLines/>
-      <w:spacing w:before="0" w:after="80" w:line="254" w:lineRule="auto"/>
+      <w:spacing w:before="200" w:after="0"/>
       <w:outlineLvl w:val="2"/>
     </w:pPr>
     <w:rPr>
-      <w:rFonts w:asciiTheme="majorHAnsi" w:eastAsiaTheme="majorEastAsia" w:hAnsiTheme="majorHAnsi" w:cstheme="majorBidi" w:ascii="Arial" w:hAnsi="Arial"/>
+      <w:rFonts w:asciiTheme="majorHAnsi" w:eastAsiaTheme="majorEastAsia" w:hAnsiTheme="majorHAnsi" w:cstheme="majorBidi"/>
       <w:b/>
       <w:bCs/>
-      <w:color w:val="000000"/>
-      <w:sz w:val="22"/>
+      <w:color w:val="4F81BD" w:themeColor="accent1"/>
     </w:rPr>
   </w:style>
   <w:style w:type="paragraph" w:styleId="Heading4">
@@ -1392,17 +1763,18 @@
     <w:qFormat/>
     <w:rsid w:val="00FC693F"/>
     <w:pPr>
-      <w:spacing w:after="80" w:line="254" w:lineRule="auto" w:before="0"/>
+      <w:keepNext/>
+      <w:spacing w:after="140" w:line="240" w:lineRule="auto" w:before="0"/>
       <w:contextualSpacing/>
     </w:pPr>
     <w:rPr>
-      <w:rFonts w:asciiTheme="majorHAnsi" w:eastAsiaTheme="majorEastAsia" w:hAnsiTheme="majorHAnsi" w:cstheme="majorBidi" w:ascii="Arial" w:hAnsi="Arial"/>
-      <w:b/>
-      <w:color w:val="000000"/>
       <w:spacing w:val="5"/>
       <w:kern w:val="28"/>
-      <w:sz w:val="40"/>
       <w:szCs w:val="52"/>
+      <w:rFonts w:ascii="Frutiger LT Com 45 Light" w:hAnsi="Frutiger LT Com 45 Light" w:eastAsia="Frutiger LT Com 45 Light" w:cs="Frutiger LT Com 45 Light"/>
+      <w:sz w:val="60"/>
+      <w:color w:val="000000"/>
+      <w:b/>
     </w:rPr>
   </w:style>
   <w:style w:type="character" w:customStyle="1" w:styleId="TitleChar">
@@ -1432,15 +1804,14 @@
       <w:numPr>
         <w:ilvl w:val="1"/>
       </w:numPr>
-      <w:spacing w:before="0" w:after="80" w:line="254" w:lineRule="auto"/>
     </w:pPr>
     <w:rPr>
-      <w:rFonts w:asciiTheme="majorHAnsi" w:eastAsiaTheme="majorEastAsia" w:hAnsiTheme="majorHAnsi" w:cstheme="majorBidi" w:ascii="Arial" w:hAnsi="Arial"/>
+      <w:rFonts w:asciiTheme="majorHAnsi" w:eastAsiaTheme="majorEastAsia" w:hAnsiTheme="majorHAnsi" w:cstheme="majorBidi"/>
       <w:i/>
       <w:iCs/>
-      <w:color w:val="000000"/>
+      <w:color w:val="4F81BD" w:themeColor="accent1"/>
       <w:spacing w:val="15"/>
-      <w:sz w:val="22"/>
+      <w:sz w:val="24"/>
       <w:szCs w:val="24"/>
     </w:rPr>
   </w:style>
@@ -12728,6 +13099,20 @@
         <w:shd w:val="clear" w:color="auto" w:fill="FBCAA2" w:themeFill="accent6" w:themeFillTint="7F"/>
       </w:tcPr>
     </w:tblStylePr>
+  </w:style>
+  <w:style w:type="paragraph" w:customStyle="1" w:styleId="Answer">
+    <w:name w:val="Answer"/>
+    <w:basedOn w:val="Normal"/>
+    <w:pPr>
+      <w:keepNext w:val="0"/>
+      <w:keepLines w:val="0"/>
+      <w:widowControl w:val="0"/>
+      <w:spacing w:before="0" w:after="0" w:line="269" w:lineRule="auto"/>
+    </w:pPr>
+    <w:rPr>
+      <w:rFonts w:ascii="Frutiger LT Com 45 Light" w:hAnsi="Frutiger LT Com 45 Light"/>
+      <w:sz w:val="28"/>
+    </w:rPr>
   </w:style>
 </w:styles>
 </file>

</xml_diff>

<commit_message>
Use an expanding workbook layout for all staff forms (#1)
</commit_message>
<xml_diff>
--- a/public/assets/Arrange_and_Hand_Over_v12.docx
+++ b/public/assets/Arrange_and_Hand_Over_v12.docx
@@ -1,11 +1,12 @@
 
 <file path=word/document.xml><?xml version="1.0" encoding="utf-8"?>
 <w:document xmlns:wpc="http://schemas.microsoft.com/office/word/2010/wordprocessingCanvas" xmlns:mo="http://schemas.microsoft.com/office/mac/office/2008/main" xmlns:mc="http://schemas.openxmlformats.org/markup-compatibility/2006" xmlns:mv="urn:schemas-microsoft-com:mac:vml" xmlns:o="urn:schemas-microsoft-com:office:office" xmlns:r="http://schemas.openxmlformats.org/officeDocument/2006/relationships" xmlns:m="http://schemas.openxmlformats.org/officeDocument/2006/math" xmlns:v="urn:schemas-microsoft-com:vml" xmlns:wp14="http://schemas.microsoft.com/office/word/2010/wordprocessingDrawing" xmlns:wp="http://schemas.openxmlformats.org/drawingml/2006/wordprocessingDrawing" xmlns:w10="urn:schemas-microsoft-com:office:word" xmlns:w="http://schemas.openxmlformats.org/wordprocessingml/2006/main" xmlns:w14="http://schemas.microsoft.com/office/word/2010/wordml" xmlns:wpg="http://schemas.microsoft.com/office/word/2010/wordprocessingGroup" xmlns:wpi="http://schemas.microsoft.com/office/word/2010/wordprocessingInk" xmlns:wne="http://schemas.microsoft.com/office/word/2006/wordml" xmlns:wps="http://schemas.microsoft.com/office/word/2010/wordprocessingShape" mc:Ignorable="w14 wp14">
+  <w:background w:color="EDF2F3"/>
   <w:body>
     <w:p>
       <w:pPr>
         <w:pStyle w:val="Title"/>
-        <w:keepNext/>
+        <w:spacing w:after="120"/>
       </w:pPr>
       <w:r>
         <w:t>Arrange the call</w:t>
@@ -13,92 +14,186 @@
     </w:p>
     <w:p>
       <w:pPr>
-        <w:keepNext w:val="0"/>
+        <w:spacing w:after="100"/>
       </w:pPr>
       <w:r>
         <w:rPr>
-          <w:sz w:val="19"/>
+          <w:sz w:val="27"/>
         </w:rPr>
-        <w:t>Lived Experience Coordinator · Use the offer form; do not copy its details again.</w:t>
+        <w:t>Lived Experience Coordinator · Type in the white boxes and tick one answer.</w:t>
       </w:r>
     </w:p>
     <w:p>
       <w:pPr>
-        <w:keepNext w:val="0"/>
+        <w:spacing w:after="160"/>
       </w:pPr>
       <w:r>
         <w:rPr>
-          <w:sz w:val="19"/>
+          <w:sz w:val="24"/>
         </w:rPr>
         <w:t>Area: [optional]   |   Team: [optional]</w:t>
       </w:r>
     </w:p>
     <w:p>
       <w:pPr>
-        <w:keepNext w:val="0"/>
+        <w:spacing w:after="120"/>
       </w:pPr>
-      <w:r/>
       <w:r>
         <w:rPr>
-          <w:b/>
+          <w:sz w:val="27"/>
         </w:rPr>
-        <w:t xml:space="preserve">Record reference  </w:t>
+        <w:t>Use the offer form. There is no need to copy its details again.</w:t>
       </w:r>
-      <w:sdt>
-        <w:sdtPr>
-          <w:alias w:val="Record reference"/>
-          <w:tag w:val="handover_1001"/>
-          <w:id w:val="1001"/>
-          <w:text w:multiLine="1"/>
-        </w:sdtPr>
-        <w:sdtContent>
-          <w:r>
-            <w:rPr>
-              <w:rFonts w:ascii="Arial" w:hAnsi="Arial"/>
-              <w:sz w:val="22"/>
-              <w:color w:val="47545B"/>
-              <w:shd w:fill="F2F5F6" w:val="clear"/>
-            </w:rPr>
-            <w:t xml:space="preserve">Reference</w:t>
-          </w:r>
-        </w:sdtContent>
-      </w:sdt>
+    </w:p>
+    <w:tbl>
+      <w:tblPr>
+        <w:tblW w:type="auto" w:w="0"/>
+        <w:tblLayout w:type="fixed"/>
+        <w:tblLook w:firstColumn="1" w:firstRow="1" w:lastColumn="0" w:lastRow="0" w:noHBand="0" w:noVBand="1" w:val="04A0"/>
+      </w:tblPr>
+      <w:tblGrid>
+        <w:gridCol w:w="5102"/>
+        <w:gridCol w:w="5102"/>
+      </w:tblGrid>
+      <w:tr>
+        <w:tc>
+          <w:tcPr>
+            <w:tcW w:type="dxa" w:w="5103"/>
+          </w:tcPr>
+          <w:p>
+            <w:pPr>
+              <w:keepNext/>
+              <w:spacing w:after="60"/>
+            </w:pPr>
+            <w:r>
+              <w:rPr>
+                <w:sz w:val="26"/>
+              </w:rPr>
+              <w:t>Record reference</w:t>
+            </w:r>
+          </w:p>
+        </w:tc>
+        <w:tc>
+          <w:tcPr>
+            <w:tcW w:type="dxa" w:w="5103"/>
+          </w:tcPr>
+          <w:p>
+            <w:pPr>
+              <w:keepNext/>
+              <w:spacing w:after="60"/>
+            </w:pPr>
+            <w:r>
+              <w:rPr>
+                <w:sz w:val="26"/>
+              </w:rPr>
+              <w:t>Coordinator and date</w:t>
+            </w:r>
+          </w:p>
+        </w:tc>
+      </w:tr>
+      <w:tr>
+        <w:trPr>
+          <w:trHeight w:val="560" w:hRule="atLeast"/>
+        </w:trPr>
+        <w:tc>
+          <w:tcPr>
+            <w:tcW w:type="dxa" w:w="5103"/>
+            <w:vAlign w:val="top"/>
+            <w:shd w:fill="FFFFFF"/>
+            <w:tcBorders>
+              <w:top w:val="single" w:sz="6" w:color="71838D"/>
+              <w:left w:val="single" w:sz="6" w:color="71838D"/>
+              <w:bottom w:val="single" w:sz="6" w:color="71838D"/>
+              <w:right w:val="single" w:sz="6" w:color="71838D"/>
+            </w:tcBorders>
+            <w:tcMar>
+              <w:top w:w="115" w:type="dxa"/>
+              <w:bottom w:w="115" w:type="dxa"/>
+              <w:left w:w="115" w:type="dxa"/>
+              <w:right w:w="115" w:type="dxa"/>
+            </w:tcMar>
+          </w:tcPr>
+          <w:sdt>
+            <w:sdtPr>
+              <w:alias w:val="Record reference"/>
+              <w:tag w:val="record_reference"/>
+              <w:id w:val="100"/>
+              <w:text w:multiLine="1"/>
+            </w:sdtPr>
+            <w:sdtContent>
+              <w:p>
+                <w:pPr>
+                  <w:pStyle w:val="Answer"/>
+                </w:pPr>
+                <w:r>
+                  <w:rPr>
+                    <w:rFonts w:ascii="Frutiger LT Com 45 Light" w:hAnsi="Frutiger LT Com 45 Light"/>
+                    <w:sz w:val="28"/>
+                  </w:rPr>
+                  <w:t xml:space="preserve"> </w:t>
+                </w:r>
+              </w:p>
+            </w:sdtContent>
+          </w:sdt>
+        </w:tc>
+        <w:tc>
+          <w:tcPr>
+            <w:tcW w:type="dxa" w:w="5103"/>
+            <w:vAlign w:val="top"/>
+            <w:shd w:fill="FFFFFF"/>
+            <w:tcBorders>
+              <w:top w:val="single" w:sz="6" w:color="71838D"/>
+              <w:left w:val="single" w:sz="6" w:color="71838D"/>
+              <w:bottom w:val="single" w:sz="6" w:color="71838D"/>
+              <w:right w:val="single" w:sz="6" w:color="71838D"/>
+            </w:tcBorders>
+            <w:tcMar>
+              <w:top w:w="115" w:type="dxa"/>
+              <w:bottom w:w="115" w:type="dxa"/>
+              <w:left w:w="115" w:type="dxa"/>
+              <w:right w:w="115" w:type="dxa"/>
+            </w:tcMar>
+          </w:tcPr>
+          <w:sdt>
+            <w:sdtPr>
+              <w:alias w:val="Coordinator and date"/>
+              <w:tag w:val="coordinator_date"/>
+              <w:id w:val="101"/>
+              <w:text w:multiLine="1"/>
+            </w:sdtPr>
+            <w:sdtContent>
+              <w:p>
+                <w:pPr>
+                  <w:pStyle w:val="Answer"/>
+                </w:pPr>
+                <w:r>
+                  <w:rPr>
+                    <w:rFonts w:ascii="Frutiger LT Com 45 Light" w:hAnsi="Frutiger LT Com 45 Light"/>
+                    <w:sz w:val="28"/>
+                  </w:rPr>
+                  <w:t xml:space="preserve"> </w:t>
+                </w:r>
+              </w:p>
+            </w:sdtContent>
+          </w:sdt>
+        </w:tc>
+      </w:tr>
+    </w:tbl>
+    <w:p>
+      <w:pPr>
+        <w:spacing w:after="0" w:before="0" w:line="60" w:lineRule="exact"/>
+      </w:pPr>
+      <w:r>
+        <w:rPr>
+          <w:sz w:val="2"/>
+        </w:rPr>
+      </w:r>
     </w:p>
     <w:p>
       <w:pPr>
-        <w:keepNext w:val="0"/>
-      </w:pPr>
-      <w:r/>
-      <w:r>
-        <w:rPr>
-          <w:b/>
-        </w:rPr>
-        <w:t xml:space="preserve">Coordinator and date  </w:t>
-      </w:r>
-      <w:sdt>
-        <w:sdtPr>
-          <w:alias w:val="Coordinator and date"/>
-          <w:tag w:val="handover_1002"/>
-          <w:id w:val="1002"/>
-          <w:text w:multiLine="1"/>
-        </w:sdtPr>
-        <w:sdtContent>
-          <w:r>
-            <w:rPr>
-              <w:rFonts w:ascii="Arial" w:hAnsi="Arial"/>
-              <w:sz w:val="22"/>
-              <w:color w:val="47545B"/>
-              <w:shd w:fill="F2F5F6" w:val="clear"/>
-            </w:rPr>
-            <w:t xml:space="preserve">Name · date</w:t>
-          </w:r>
-        </w:sdtContent>
-      </w:sdt>
-    </w:p>
-    <w:p>
-      <w:pPr>
-        <w:pStyle w:val="Heading2"/>
-        <w:keepNext/>
+        <w:pStyle w:val="Heading1"/>
+        <w:pageBreakBefore w:val="0"/>
+        <w:spacing w:after="140"/>
       </w:pPr>
       <w:r>
         <w:t>1 Agree the caller</w:t>
@@ -106,277 +201,607 @@
     </w:p>
     <w:p>
       <w:pPr>
-        <w:keepNext w:val="0"/>
+        <w:pStyle w:val="Heading2"/>
+        <w:spacing w:after="120"/>
       </w:pPr>
-      <w:r/>
+      <w:r>
+        <w:t>Caller and agreed call time</w:t>
+      </w:r>
+    </w:p>
+    <w:tbl>
+      <w:tblPr>
+        <w:tblW w:type="auto" w:w="0"/>
+        <w:jc w:val="left"/>
+        <w:tblLayout w:type="fixed"/>
+        <w:tblLook w:firstColumn="1" w:firstRow="1" w:lastColumn="0" w:lastRow="0" w:noHBand="0" w:noVBand="1" w:val="04A0"/>
+      </w:tblPr>
+      <w:tblGrid>
+        <w:gridCol w:w="10205"/>
+      </w:tblGrid>
+      <w:tr>
+        <w:trPr>
+          <w:trHeight w:val="1100" w:hRule="atLeast"/>
+        </w:trPr>
+        <w:tc>
+          <w:tcPr>
+            <w:tcW w:type="dxa" w:w="10206"/>
+            <w:vAlign w:val="top"/>
+            <w:shd w:fill="FFFFFF"/>
+            <w:tcBorders>
+              <w:top w:val="single" w:sz="6" w:color="71838D"/>
+              <w:left w:val="single" w:sz="6" w:color="71838D"/>
+              <w:bottom w:val="single" w:sz="6" w:color="71838D"/>
+              <w:right w:val="single" w:sz="6" w:color="71838D"/>
+            </w:tcBorders>
+            <w:tcMar>
+              <w:top w:w="115" w:type="dxa"/>
+              <w:bottom w:w="115" w:type="dxa"/>
+              <w:left w:w="115" w:type="dxa"/>
+              <w:right w:w="115" w:type="dxa"/>
+            </w:tcMar>
+          </w:tcPr>
+          <w:sdt>
+            <w:sdtPr>
+              <w:alias w:val="Caller and agreed call time"/>
+              <w:tag w:val="caller_and_time"/>
+              <w:id w:val="102"/>
+              <w:text w:multiLine="1"/>
+            </w:sdtPr>
+            <w:sdtContent>
+              <w:p>
+                <w:pPr>
+                  <w:pStyle w:val="Answer"/>
+                </w:pPr>
+                <w:r>
+                  <w:rPr>
+                    <w:rFonts w:ascii="Frutiger LT Com 45 Light" w:hAnsi="Frutiger LT Com 45 Light"/>
+                    <w:sz w:val="28"/>
+                  </w:rPr>
+                  <w:t xml:space="preserve"> </w:t>
+                </w:r>
+              </w:p>
+            </w:sdtContent>
+          </w:sdt>
+        </w:tc>
+      </w:tr>
+    </w:tbl>
+    <w:p>
+      <w:pPr>
+        <w:spacing w:after="0" w:before="0" w:line="60" w:lineRule="exact"/>
+      </w:pPr>
       <w:r>
         <w:rPr>
-          <w:b/>
+          <w:sz w:val="2"/>
         </w:rPr>
-        <w:t xml:space="preserve">Caller and agreed call time  </w:t>
       </w:r>
-      <w:sdt>
-        <w:sdtPr>
-          <w:alias w:val="Caller and agreed call time"/>
-          <w:tag w:val="handover_1003"/>
-          <w:id w:val="1003"/>
-          <w:text w:multiLine="1"/>
-        </w:sdtPr>
-        <w:sdtContent>
-          <w:r>
-            <w:rPr>
-              <w:rFonts w:ascii="Arial" w:hAnsi="Arial"/>
-              <w:sz w:val="22"/>
-              <w:color w:val="47545B"/>
-              <w:shd w:fill="F2F5F6" w:val="clear"/>
-            </w:rPr>
-            <w:t xml:space="preserve">Name · date or time window</w:t>
-          </w:r>
-        </w:sdtContent>
-      </w:sdt>
     </w:p>
     <w:p>
       <w:pPr>
-        <w:keepNext w:val="0"/>
+        <w:pStyle w:val="Heading2"/>
+        <w:spacing w:after="120"/>
       </w:pPr>
-      <w:r/>
+      <w:r>
+        <w:t>Cover name and contact if needed</w:t>
+      </w:r>
+    </w:p>
+    <w:tbl>
+      <w:tblPr>
+        <w:tblW w:type="auto" w:w="0"/>
+        <w:jc w:val="left"/>
+        <w:tblLayout w:type="fixed"/>
+        <w:tblLook w:firstColumn="1" w:firstRow="1" w:lastColumn="0" w:lastRow="0" w:noHBand="0" w:noVBand="1" w:val="04A0"/>
+      </w:tblPr>
+      <w:tblGrid>
+        <w:gridCol w:w="10205"/>
+      </w:tblGrid>
+      <w:tr>
+        <w:trPr>
+          <w:trHeight w:val="1000" w:hRule="atLeast"/>
+        </w:trPr>
+        <w:tc>
+          <w:tcPr>
+            <w:tcW w:type="dxa" w:w="10206"/>
+            <w:vAlign w:val="top"/>
+            <w:shd w:fill="FFFFFF"/>
+            <w:tcBorders>
+              <w:top w:val="single" w:sz="6" w:color="71838D"/>
+              <w:left w:val="single" w:sz="6" w:color="71838D"/>
+              <w:bottom w:val="single" w:sz="6" w:color="71838D"/>
+              <w:right w:val="single" w:sz="6" w:color="71838D"/>
+            </w:tcBorders>
+            <w:tcMar>
+              <w:top w:w="115" w:type="dxa"/>
+              <w:bottom w:w="115" w:type="dxa"/>
+              <w:left w:w="115" w:type="dxa"/>
+              <w:right w:w="115" w:type="dxa"/>
+            </w:tcMar>
+          </w:tcPr>
+          <w:sdt>
+            <w:sdtPr>
+              <w:alias w:val="Cover name and contact if needed"/>
+              <w:tag w:val="cover_contact"/>
+              <w:id w:val="103"/>
+              <w:text w:multiLine="1"/>
+            </w:sdtPr>
+            <w:sdtContent>
+              <w:p>
+                <w:pPr>
+                  <w:pStyle w:val="Answer"/>
+                </w:pPr>
+                <w:r>
+                  <w:rPr>
+                    <w:rFonts w:ascii="Frutiger LT Com 45 Light" w:hAnsi="Frutiger LT Com 45 Light"/>
+                    <w:sz w:val="28"/>
+                  </w:rPr>
+                  <w:t xml:space="preserve"> </w:t>
+                </w:r>
+              </w:p>
+            </w:sdtContent>
+          </w:sdt>
+        </w:tc>
+      </w:tr>
+    </w:tbl>
+    <w:p>
+      <w:pPr>
+        <w:spacing w:after="0" w:before="0" w:line="60" w:lineRule="exact"/>
+      </w:pPr>
       <w:r>
         <w:rPr>
-          <w:b/>
+          <w:sz w:val="2"/>
         </w:rPr>
-        <w:t xml:space="preserve">Cover if needed  </w:t>
       </w:r>
-      <w:sdt>
-        <w:sdtPr>
-          <w:alias w:val="Cover if needed"/>
-          <w:tag w:val="handover_1004"/>
-          <w:id w:val="1004"/>
-          <w:text w:multiLine="1"/>
-        </w:sdtPr>
-        <w:sdtContent>
-          <w:r>
-            <w:rPr>
-              <w:rFonts w:ascii="Arial" w:hAnsi="Arial"/>
-              <w:sz w:val="22"/>
-              <w:color w:val="47545B"/>
-              <w:shd w:fill="F2F5F6" w:val="clear"/>
-            </w:rPr>
-            <w:t xml:space="preserve">Name and contact route</w:t>
-          </w:r>
-        </w:sdtContent>
-      </w:sdt>
     </w:p>
     <w:p>
       <w:pPr>
-        <w:keepNext w:val="0"/>
+        <w:spacing w:after="100"/>
       </w:pPr>
       <w:r>
         <w:rPr>
-          <w:sz w:val="19"/>
+          <w:sz w:val="27"/>
         </w:rPr>
         <w:t>Check the caller can open the offer form and use the agreed safe contact and communication arrangements.</w:t>
       </w:r>
     </w:p>
     <w:p>
       <w:pPr>
-        <w:pStyle w:val="Heading2"/>
-        <w:keepNext/>
+        <w:pStyle w:val="Heading1"/>
+        <w:pageBreakBefore w:val="0"/>
+        <w:spacing w:after="140"/>
       </w:pPr>
       <w:r>
-        <w:t>2 Give the caller the help routes</w:t>
-      </w:r>
-    </w:p>
-    <w:p>
-      <w:pPr>
-        <w:keepNext w:val="0"/>
-      </w:pPr>
-      <w:r/>
-      <w:r>
-        <w:rPr>
-          <w:b/>
-        </w:rPr>
-        <w:t xml:space="preserve">Clinical or safeguarding help  </w:t>
-      </w:r>
-      <w:sdt>
-        <w:sdtPr>
-          <w:alias w:val="Clinical or safeguarding help"/>
-          <w:tag w:val="handover_1005"/>
-          <w:id w:val="1005"/>
-          <w:text w:multiLine="1"/>
-        </w:sdtPr>
-        <w:sdtContent>
-          <w:r>
-            <w:rPr>
-              <w:rFonts w:ascii="Arial" w:hAnsi="Arial"/>
-              <w:sz w:val="22"/>
-              <w:color w:val="47545B"/>
-              <w:shd w:fill="F2F5F6" w:val="clear"/>
-            </w:rPr>
-            <w:t xml:space="preserve">Team and contact route</w:t>
-          </w:r>
-        </w:sdtContent>
-      </w:sdt>
-    </w:p>
-    <w:p>
-      <w:pPr>
-        <w:keepNext w:val="0"/>
-      </w:pPr>
-      <w:r/>
-      <w:r>
-        <w:rPr>
-          <w:b/>
-        </w:rPr>
-        <w:t xml:space="preserve">Backup if no response  </w:t>
-      </w:r>
-      <w:sdt>
-        <w:sdtPr>
-          <w:alias w:val="Backup if no response"/>
-          <w:tag w:val="handover_1006"/>
-          <w:id w:val="1006"/>
-          <w:text w:multiLine="1"/>
-        </w:sdtPr>
-        <w:sdtContent>
-          <w:r>
-            <w:rPr>
-              <w:rFonts w:ascii="Arial" w:hAnsi="Arial"/>
-              <w:sz w:val="22"/>
-              <w:color w:val="47545B"/>
-              <w:shd w:fill="F2F5F6" w:val="clear"/>
-            </w:rPr>
-            <w:t xml:space="preserve">Team and contact route</w:t>
-          </w:r>
-        </w:sdtContent>
-      </w:sdt>
-    </w:p>
-    <w:p>
-      <w:pPr>
-        <w:keepNext/>
-      </w:pPr>
-      <w:r>
-        <w:rPr>
-          <w:b/>
-        </w:rPr>
-        <w:t>Identity check and no answer plan</w:t>
-      </w:r>
-    </w:p>
-    <w:p>
-      <w:pPr>
-        <w:keepNext w:val="0"/>
-        <w:keepLines/>
-        <w:spacing w:after="100"/>
-        <w:shd w:fill="F2F5F6" w:val="clear"/>
-      </w:pPr>
-      <w:r/>
-      <w:sdt>
-        <w:sdtPr>
-          <w:alias w:val="Identity check and no answer plan"/>
-          <w:tag w:val="handover_1007"/>
-          <w:id w:val="1007"/>
-          <w:text w:multiLine="1"/>
-        </w:sdtPr>
-        <w:sdtContent>
-          <w:r>
-            <w:rPr>
-              <w:rFonts w:ascii="Arial" w:hAnsi="Arial"/>
-              <w:sz w:val="22"/>
-              <w:color w:val="47545B"/>
-              <w:shd w:fill="F2F5F6" w:val="clear"/>
-            </w:rPr>
-            <w:t xml:space="preserve">Local instructions or where to find them</w:t>
-            <w:br/>
-            <w:t> </w:t>
-          </w:r>
-        </w:sdtContent>
-      </w:sdt>
-    </w:p>
-    <w:p>
-      <w:pPr>
-        <w:keepNext w:val="0"/>
-      </w:pPr>
-      <w:r>
-        <w:rPr>
-          <w:sz w:val="19"/>
-        </w:rPr>
-        <w:t>Use the voicemail choice in the offer form. No answer does not confirm safety.</w:t>
-      </w:r>
-    </w:p>
-    <w:p>
-      <w:pPr>
-        <w:keepNext w:val="0"/>
-      </w:pPr>
-      <w:r/>
-      <w:r>
-        <w:rPr>
-          <w:b/>
-        </w:rPr>
-        <w:t xml:space="preserve">Where to save the call form  </w:t>
-      </w:r>
-      <w:sdt>
-        <w:sdtPr>
-          <w:alias w:val="Where to save the call form"/>
-          <w:tag w:val="handover_1008"/>
-          <w:id w:val="1008"/>
-          <w:text w:multiLine="1"/>
-        </w:sdtPr>
-        <w:sdtContent>
-          <w:r>
-            <w:rPr>
-              <w:rFonts w:ascii="Arial" w:hAnsi="Arial"/>
-              <w:sz w:val="22"/>
-              <w:color w:val="47545B"/>
-              <w:shd w:fill="F2F5F6" w:val="clear"/>
-            </w:rPr>
-            <w:t xml:space="preserve">SystmOne record; for a carer, their agreed record</w:t>
-          </w:r>
-        </w:sdtContent>
-      </w:sdt>
-    </w:p>
-    <w:p>
-      <w:pPr>
-        <w:keepNext w:val="0"/>
-      </w:pPr>
-      <w:r/>
-      <w:r>
-        <w:rPr>
-          <w:b/>
-        </w:rPr>
-        <w:t xml:space="preserve">Who reviews agreed project feedback?  </w:t>
-      </w:r>
-      <w:sdt>
-        <w:sdtPr>
-          <w:alias w:val="Who reviews agreed project feedback?"/>
-          <w:tag w:val="handover_1009"/>
-          <w:id w:val="1009"/>
-          <w:text w:multiLine="1"/>
-        </w:sdtPr>
-        <w:sdtContent>
-          <w:r>
-            <w:rPr>
-              <w:rFonts w:ascii="Arial" w:hAnsi="Arial"/>
-              <w:sz w:val="22"/>
-              <w:color w:val="47545B"/>
-              <w:shd w:fill="F2F5F6" w:val="clear"/>
-            </w:rPr>
-            <w:t xml:space="preserve">Authorised reviewer and secure access to the record</w:t>
-          </w:r>
-        </w:sdtContent>
-      </w:sdt>
-    </w:p>
-    <w:p>
-      <w:pPr>
-        <w:keepNext w:val="0"/>
-      </w:pPr>
-      <w:r>
-        <w:rPr>
-          <w:sz w:val="19"/>
-        </w:rPr>
-        <w:t>Feedback is inside the call form. Arrange review of that record; the caller does not complete another feedback form.</w:t>
+        <w:t>2 Give the help routes</w:t>
       </w:r>
     </w:p>
     <w:p>
       <w:pPr>
         <w:pStyle w:val="Heading2"/>
-        <w:keepNext/>
+        <w:spacing w:after="120"/>
+      </w:pPr>
+      <w:r>
+        <w:t>Clinical or safeguarding team and contact</w:t>
+      </w:r>
+    </w:p>
+    <w:tbl>
+      <w:tblPr>
+        <w:tblW w:type="auto" w:w="0"/>
+        <w:jc w:val="left"/>
+        <w:tblLayout w:type="fixed"/>
+        <w:tblLook w:firstColumn="1" w:firstRow="1" w:lastColumn="0" w:lastRow="0" w:noHBand="0" w:noVBand="1" w:val="04A0"/>
+      </w:tblPr>
+      <w:tblGrid>
+        <w:gridCol w:w="10205"/>
+      </w:tblGrid>
+      <w:tr>
+        <w:trPr>
+          <w:trHeight w:val="1100" w:hRule="atLeast"/>
+        </w:trPr>
+        <w:tc>
+          <w:tcPr>
+            <w:tcW w:type="dxa" w:w="10206"/>
+            <w:vAlign w:val="top"/>
+            <w:shd w:fill="FFFFFF"/>
+            <w:tcBorders>
+              <w:top w:val="single" w:sz="6" w:color="71838D"/>
+              <w:left w:val="single" w:sz="6" w:color="71838D"/>
+              <w:bottom w:val="single" w:sz="6" w:color="71838D"/>
+              <w:right w:val="single" w:sz="6" w:color="71838D"/>
+            </w:tcBorders>
+            <w:tcMar>
+              <w:top w:w="115" w:type="dxa"/>
+              <w:bottom w:w="115" w:type="dxa"/>
+              <w:left w:w="115" w:type="dxa"/>
+              <w:right w:w="115" w:type="dxa"/>
+            </w:tcMar>
+          </w:tcPr>
+          <w:sdt>
+            <w:sdtPr>
+              <w:alias w:val="Clinical or safeguarding team and contact"/>
+              <w:tag w:val="clinical_help"/>
+              <w:id w:val="104"/>
+              <w:text w:multiLine="1"/>
+            </w:sdtPr>
+            <w:sdtContent>
+              <w:p>
+                <w:pPr>
+                  <w:pStyle w:val="Answer"/>
+                </w:pPr>
+                <w:r>
+                  <w:rPr>
+                    <w:rFonts w:ascii="Frutiger LT Com 45 Light" w:hAnsi="Frutiger LT Com 45 Light"/>
+                    <w:sz w:val="28"/>
+                  </w:rPr>
+                  <w:t xml:space="preserve"> </w:t>
+                </w:r>
+              </w:p>
+            </w:sdtContent>
+          </w:sdt>
+        </w:tc>
+      </w:tr>
+    </w:tbl>
+    <w:p>
+      <w:pPr>
+        <w:spacing w:after="0" w:before="0" w:line="60" w:lineRule="exact"/>
+      </w:pPr>
+      <w:r>
+        <w:rPr>
+          <w:sz w:val="2"/>
+        </w:rPr>
+      </w:r>
+    </w:p>
+    <w:p>
+      <w:pPr>
+        <w:pStyle w:val="Heading2"/>
+        <w:spacing w:after="120"/>
+      </w:pPr>
+      <w:r>
+        <w:t>Backup contact if no response</w:t>
+      </w:r>
+    </w:p>
+    <w:tbl>
+      <w:tblPr>
+        <w:tblW w:type="auto" w:w="0"/>
+        <w:jc w:val="left"/>
+        <w:tblLayout w:type="fixed"/>
+        <w:tblLook w:firstColumn="1" w:firstRow="1" w:lastColumn="0" w:lastRow="0" w:noHBand="0" w:noVBand="1" w:val="04A0"/>
+      </w:tblPr>
+      <w:tblGrid>
+        <w:gridCol w:w="10205"/>
+      </w:tblGrid>
+      <w:tr>
+        <w:trPr>
+          <w:trHeight w:val="1100" w:hRule="atLeast"/>
+        </w:trPr>
+        <w:tc>
+          <w:tcPr>
+            <w:tcW w:type="dxa" w:w="10206"/>
+            <w:vAlign w:val="top"/>
+            <w:shd w:fill="FFFFFF"/>
+            <w:tcBorders>
+              <w:top w:val="single" w:sz="6" w:color="71838D"/>
+              <w:left w:val="single" w:sz="6" w:color="71838D"/>
+              <w:bottom w:val="single" w:sz="6" w:color="71838D"/>
+              <w:right w:val="single" w:sz="6" w:color="71838D"/>
+            </w:tcBorders>
+            <w:tcMar>
+              <w:top w:w="115" w:type="dxa"/>
+              <w:bottom w:w="115" w:type="dxa"/>
+              <w:left w:w="115" w:type="dxa"/>
+              <w:right w:w="115" w:type="dxa"/>
+            </w:tcMar>
+          </w:tcPr>
+          <w:sdt>
+            <w:sdtPr>
+              <w:alias w:val="Backup contact if no response"/>
+              <w:tag w:val="backup_help"/>
+              <w:id w:val="105"/>
+              <w:text w:multiLine="1"/>
+            </w:sdtPr>
+            <w:sdtContent>
+              <w:p>
+                <w:pPr>
+                  <w:pStyle w:val="Answer"/>
+                </w:pPr>
+                <w:r>
+                  <w:rPr>
+                    <w:rFonts w:ascii="Frutiger LT Com 45 Light" w:hAnsi="Frutiger LT Com 45 Light"/>
+                    <w:sz w:val="28"/>
+                  </w:rPr>
+                  <w:t xml:space="preserve"> </w:t>
+                </w:r>
+              </w:p>
+            </w:sdtContent>
+          </w:sdt>
+        </w:tc>
+      </w:tr>
+    </w:tbl>
+    <w:p>
+      <w:pPr>
+        <w:spacing w:after="0" w:before="0" w:line="60" w:lineRule="exact"/>
+      </w:pPr>
+      <w:r>
+        <w:rPr>
+          <w:sz w:val="2"/>
+        </w:rPr>
+      </w:r>
+    </w:p>
+    <w:p>
+      <w:pPr>
+        <w:pStyle w:val="Heading1"/>
+        <w:pageBreakBefore/>
+        <w:spacing w:after="140"/>
+      </w:pPr>
+      <w:r>
+        <w:t>2 Give the help routes continued</w:t>
+      </w:r>
+    </w:p>
+    <w:p>
+      <w:pPr>
+        <w:pStyle w:val="Heading2"/>
+        <w:spacing w:after="120"/>
+      </w:pPr>
+      <w:r>
+        <w:t>Identity check and no answer plan</w:t>
+      </w:r>
+    </w:p>
+    <w:tbl>
+      <w:tblPr>
+        <w:tblW w:type="auto" w:w="0"/>
+        <w:jc w:val="left"/>
+        <w:tblLayout w:type="fixed"/>
+        <w:tblLook w:firstColumn="1" w:firstRow="1" w:lastColumn="0" w:lastRow="0" w:noHBand="0" w:noVBand="1" w:val="04A0"/>
+      </w:tblPr>
+      <w:tblGrid>
+        <w:gridCol w:w="10205"/>
+      </w:tblGrid>
+      <w:tr>
+        <w:trPr>
+          <w:trHeight w:val="1600" w:hRule="atLeast"/>
+        </w:trPr>
+        <w:tc>
+          <w:tcPr>
+            <w:tcW w:type="dxa" w:w="10206"/>
+            <w:vAlign w:val="top"/>
+            <w:shd w:fill="FFFFFF"/>
+            <w:tcBorders>
+              <w:top w:val="single" w:sz="6" w:color="71838D"/>
+              <w:left w:val="single" w:sz="6" w:color="71838D"/>
+              <w:bottom w:val="single" w:sz="6" w:color="71838D"/>
+              <w:right w:val="single" w:sz="6" w:color="71838D"/>
+            </w:tcBorders>
+            <w:tcMar>
+              <w:top w:w="115" w:type="dxa"/>
+              <w:bottom w:w="115" w:type="dxa"/>
+              <w:left w:w="115" w:type="dxa"/>
+              <w:right w:w="115" w:type="dxa"/>
+            </w:tcMar>
+          </w:tcPr>
+          <w:sdt>
+            <w:sdtPr>
+              <w:alias w:val="Identity check and no answer plan"/>
+              <w:tag w:val="identity_and_no_answer"/>
+              <w:id w:val="106"/>
+              <w:text w:multiLine="1"/>
+            </w:sdtPr>
+            <w:sdtContent>
+              <w:p>
+                <w:pPr>
+                  <w:pStyle w:val="Answer"/>
+                </w:pPr>
+                <w:r>
+                  <w:rPr>
+                    <w:rFonts w:ascii="Frutiger LT Com 45 Light" w:hAnsi="Frutiger LT Com 45 Light"/>
+                    <w:sz w:val="28"/>
+                  </w:rPr>
+                  <w:t xml:space="preserve"> </w:t>
+                </w:r>
+              </w:p>
+            </w:sdtContent>
+          </w:sdt>
+        </w:tc>
+      </w:tr>
+    </w:tbl>
+    <w:p>
+      <w:pPr>
+        <w:spacing w:after="0" w:before="0" w:line="60" w:lineRule="exact"/>
+      </w:pPr>
+      <w:r>
+        <w:rPr>
+          <w:sz w:val="2"/>
+        </w:rPr>
+      </w:r>
+    </w:p>
+    <w:p>
+      <w:pPr>
+        <w:spacing w:after="120"/>
+      </w:pPr>
+      <w:r>
+        <w:rPr>
+          <w:sz w:val="27"/>
+        </w:rPr>
+        <w:t>Use the voicemail choice in the offer form.</w:t>
+        <w:br/>
+        <w:t>No answer does not confirm safety.</w:t>
+      </w:r>
+    </w:p>
+    <w:p>
+      <w:pPr>
+        <w:pStyle w:val="Heading2"/>
+        <w:spacing w:after="120"/>
+      </w:pPr>
+      <w:r>
+        <w:t>Where should the call form be saved?</w:t>
+      </w:r>
+    </w:p>
+    <w:tbl>
+      <w:tblPr>
+        <w:tblW w:type="auto" w:w="0"/>
+        <w:jc w:val="left"/>
+        <w:tblLayout w:type="fixed"/>
+        <w:tblLook w:firstColumn="1" w:firstRow="1" w:lastColumn="0" w:lastRow="0" w:noHBand="0" w:noVBand="1" w:val="04A0"/>
+      </w:tblPr>
+      <w:tblGrid>
+        <w:gridCol w:w="10205"/>
+      </w:tblGrid>
+      <w:tr>
+        <w:trPr>
+          <w:trHeight w:val="1100" w:hRule="atLeast"/>
+        </w:trPr>
+        <w:tc>
+          <w:tcPr>
+            <w:tcW w:type="dxa" w:w="10206"/>
+            <w:vAlign w:val="top"/>
+            <w:shd w:fill="FFFFFF"/>
+            <w:tcBorders>
+              <w:top w:val="single" w:sz="6" w:color="71838D"/>
+              <w:left w:val="single" w:sz="6" w:color="71838D"/>
+              <w:bottom w:val="single" w:sz="6" w:color="71838D"/>
+              <w:right w:val="single" w:sz="6" w:color="71838D"/>
+            </w:tcBorders>
+            <w:tcMar>
+              <w:top w:w="115" w:type="dxa"/>
+              <w:bottom w:w="115" w:type="dxa"/>
+              <w:left w:w="115" w:type="dxa"/>
+              <w:right w:w="115" w:type="dxa"/>
+            </w:tcMar>
+          </w:tcPr>
+          <w:sdt>
+            <w:sdtPr>
+              <w:alias w:val="Where should the call form be saved?"/>
+              <w:tag w:val="record_location"/>
+              <w:id w:val="107"/>
+              <w:text w:multiLine="1"/>
+            </w:sdtPr>
+            <w:sdtContent>
+              <w:p>
+                <w:pPr>
+                  <w:pStyle w:val="Answer"/>
+                </w:pPr>
+                <w:r>
+                  <w:rPr>
+                    <w:rFonts w:ascii="Frutiger LT Com 45 Light" w:hAnsi="Frutiger LT Com 45 Light"/>
+                    <w:sz w:val="28"/>
+                  </w:rPr>
+                  <w:t xml:space="preserve"> </w:t>
+                </w:r>
+              </w:p>
+            </w:sdtContent>
+          </w:sdt>
+        </w:tc>
+      </w:tr>
+    </w:tbl>
+    <w:p>
+      <w:pPr>
+        <w:spacing w:after="0" w:before="0" w:line="60" w:lineRule="exact"/>
+      </w:pPr>
+      <w:r>
+        <w:rPr>
+          <w:sz w:val="2"/>
+        </w:rPr>
+      </w:r>
+    </w:p>
+    <w:p>
+      <w:pPr>
+        <w:spacing w:after="120"/>
+      </w:pPr>
+      <w:r>
+        <w:rPr>
+          <w:sz w:val="27"/>
+        </w:rPr>
+        <w:t>Use the person’s SystmOne record. For a carer, use their own agreed record.</w:t>
+      </w:r>
+    </w:p>
+    <w:p>
+      <w:pPr>
+        <w:pStyle w:val="Heading2"/>
+        <w:spacing w:after="120"/>
+      </w:pPr>
+      <w:r>
+        <w:t>Who reviews the agreed project feedback?</w:t>
+      </w:r>
+    </w:p>
+    <w:tbl>
+      <w:tblPr>
+        <w:tblW w:type="auto" w:w="0"/>
+        <w:jc w:val="left"/>
+        <w:tblLayout w:type="fixed"/>
+        <w:tblLook w:firstColumn="1" w:firstRow="1" w:lastColumn="0" w:lastRow="0" w:noHBand="0" w:noVBand="1" w:val="04A0"/>
+      </w:tblPr>
+      <w:tblGrid>
+        <w:gridCol w:w="10205"/>
+      </w:tblGrid>
+      <w:tr>
+        <w:trPr>
+          <w:trHeight w:val="1100" w:hRule="atLeast"/>
+        </w:trPr>
+        <w:tc>
+          <w:tcPr>
+            <w:tcW w:type="dxa" w:w="10206"/>
+            <w:vAlign w:val="top"/>
+            <w:shd w:fill="FFFFFF"/>
+            <w:tcBorders>
+              <w:top w:val="single" w:sz="6" w:color="71838D"/>
+              <w:left w:val="single" w:sz="6" w:color="71838D"/>
+              <w:bottom w:val="single" w:sz="6" w:color="71838D"/>
+              <w:right w:val="single" w:sz="6" w:color="71838D"/>
+            </w:tcBorders>
+            <w:tcMar>
+              <w:top w:w="115" w:type="dxa"/>
+              <w:bottom w:w="115" w:type="dxa"/>
+              <w:left w:w="115" w:type="dxa"/>
+              <w:right w:w="115" w:type="dxa"/>
+            </w:tcMar>
+          </w:tcPr>
+          <w:sdt>
+            <w:sdtPr>
+              <w:alias w:val="Who reviews the agreed project feedback?"/>
+              <w:tag w:val="feedback_reviewer"/>
+              <w:id w:val="108"/>
+              <w:text w:multiLine="1"/>
+            </w:sdtPr>
+            <w:sdtContent>
+              <w:p>
+                <w:pPr>
+                  <w:pStyle w:val="Answer"/>
+                </w:pPr>
+                <w:r>
+                  <w:rPr>
+                    <w:rFonts w:ascii="Frutiger LT Com 45 Light" w:hAnsi="Frutiger LT Com 45 Light"/>
+                    <w:sz w:val="28"/>
+                  </w:rPr>
+                  <w:t xml:space="preserve"> </w:t>
+                </w:r>
+              </w:p>
+            </w:sdtContent>
+          </w:sdt>
+        </w:tc>
+      </w:tr>
+    </w:tbl>
+    <w:p>
+      <w:pPr>
+        <w:spacing w:after="0" w:before="0" w:line="60" w:lineRule="exact"/>
+      </w:pPr>
+      <w:r>
+        <w:rPr>
+          <w:sz w:val="2"/>
+        </w:rPr>
+      </w:r>
+    </w:p>
+    <w:p>
+      <w:pPr>
+        <w:spacing w:after="120"/>
+      </w:pPr>
+      <w:r>
+        <w:rPr>
+          <w:sz w:val="27"/>
+        </w:rPr>
+        <w:t>Name the authorised reviewer and their secure access to the record. Feedback stays in the call form. The caller does not complete another feedback form.</w:t>
+      </w:r>
+    </w:p>
+    <w:p>
+      <w:pPr>
+        <w:pStyle w:val="Heading1"/>
+        <w:pageBreakBefore w:val="0"/>
+        <w:spacing w:after="140"/>
       </w:pPr>
       <w:r>
         <w:t>3 Confirm the handover</w:t>
@@ -384,90 +809,162 @@
     </w:p>
     <w:p>
       <w:pPr>
-        <w:keepNext w:val="0"/>
-        <w:spacing w:after="60"/>
+        <w:spacing w:after="140"/>
       </w:pPr>
       <w:r/>
       <w:sdt>
         <w:sdtPr>
-          <w:alias w:val="Caller has accepted, can access the record and knows the contact and help plans."/>
-          <w:tag w:val="handover_1010"/>
-          <w:id w:val="1010"/>
+          <w:id w:val="109"/>
+          <w:alias w:val="Caller has accepted and can access the record."/>
+          <w:tag w:val="handover_accepted"/>
           <w14:checkbox>
             <w14:checked w14:val="0"/>
-            <w14:checkedState w14:val="2612" w14:font="Segoe UI Symbol"/>
-            <w14:uncheckedState w14:val="2610" w14:font="Segoe UI Symbol"/>
+            <w14:checkedState w14:val="2611" w14:font="DejaVu Sans"/>
+            <w14:uncheckedState w14:val="2610" w14:font="DejaVu Sans"/>
           </w14:checkbox>
         </w:sdtPr>
         <w:sdtContent>
           <w:r>
             <w:rPr>
-              <w:rFonts w:ascii="Arial" w:hAnsi="Arial"/>
-              <w:sz w:val="22"/>
+              <w:rFonts w:ascii="DejaVu Sans" w:hAnsi="DejaVu Sans" w:eastAsia="DejaVu Sans" w:cs="DejaVu Sans"/>
+              <w:sz w:val="28"/>
+              <w:color w:val="172C38"/>
+              <w:shd w:fill="FFFFFF"/>
             </w:rPr>
-            <w:t xml:space="preserve">☐</w:t>
+            <w:t>☐</w:t>
           </w:r>
         </w:sdtContent>
       </w:sdt>
       <w:r>
-        <w:t xml:space="preserve"> Caller has accepted, can access the record and knows the contact and help plans.</w:t>
+        <w:t xml:space="preserve"> Caller has accepted and can access the record.     </w:t>
       </w:r>
     </w:p>
     <w:p>
       <w:pPr>
-        <w:keepNext/>
+        <w:spacing w:after="140"/>
       </w:pPr>
+      <w:r/>
+      <w:sdt>
+        <w:sdtPr>
+          <w:id w:val="110"/>
+          <w:alias w:val="Caller knows the contact and help plans."/>
+          <w:tag w:val="plans_understood"/>
+          <w14:checkbox>
+            <w14:checked w14:val="0"/>
+            <w14:checkedState w14:val="2611" w14:font="DejaVu Sans"/>
+            <w14:uncheckedState w14:val="2610" w14:font="DejaVu Sans"/>
+          </w14:checkbox>
+        </w:sdtPr>
+        <w:sdtContent>
+          <w:r>
+            <w:rPr>
+              <w:rFonts w:ascii="DejaVu Sans" w:hAnsi="DejaVu Sans" w:eastAsia="DejaVu Sans" w:cs="DejaVu Sans"/>
+              <w:sz w:val="28"/>
+              <w:color w:val="172C38"/>
+              <w:shd w:fill="FFFFFF"/>
+            </w:rPr>
+            <w:t>☐</w:t>
+          </w:r>
+        </w:sdtContent>
+      </w:sdt>
       <w:r>
-        <w:rPr>
-          <w:b/>
-        </w:rPr>
-        <w:t>Anything still needed</w:t>
+        <w:t xml:space="preserve"> Caller knows the contact and help plans.     </w:t>
       </w:r>
     </w:p>
     <w:p>
       <w:pPr>
-        <w:keepNext w:val="0"/>
-        <w:keepLines/>
-        <w:spacing w:after="100"/>
-        <w:shd w:fill="F2F5F6" w:val="clear"/>
+        <w:pStyle w:val="Heading2"/>
+        <w:spacing w:after="120"/>
       </w:pPr>
-      <w:r/>
-      <w:sdt>
-        <w:sdtPr>
-          <w:alias w:val="Anything still needed"/>
-          <w:tag w:val="handover_1011"/>
-          <w:id w:val="1011"/>
-          <w:text w:multiLine="1"/>
-        </w:sdtPr>
-        <w:sdtContent>
-          <w:r>
-            <w:rPr>
-              <w:rFonts w:ascii="Arial" w:hAnsi="Arial"/>
-              <w:sz w:val="22"/>
-              <w:color w:val="47545B"/>
-              <w:shd w:fill="F2F5F6" w:val="clear"/>
-            </w:rPr>
-            <w:t xml:space="preserve">Action, who will do it and when; or Nothing outstanding</w:t>
-          </w:r>
-        </w:sdtContent>
-      </w:sdt>
+      <w:r>
+        <w:t>Anything still needed</w:t>
+      </w:r>
+    </w:p>
+    <w:tbl>
+      <w:tblPr>
+        <w:tblW w:type="auto" w:w="0"/>
+        <w:jc w:val="left"/>
+        <w:tblLayout w:type="fixed"/>
+        <w:tblLook w:firstColumn="1" w:firstRow="1" w:lastColumn="0" w:lastRow="0" w:noHBand="0" w:noVBand="1" w:val="04A0"/>
+      </w:tblPr>
+      <w:tblGrid>
+        <w:gridCol w:w="10205"/>
+      </w:tblGrid>
+      <w:tr>
+        <w:trPr>
+          <w:trHeight w:val="1100" w:hRule="atLeast"/>
+        </w:trPr>
+        <w:tc>
+          <w:tcPr>
+            <w:tcW w:type="dxa" w:w="10206"/>
+            <w:vAlign w:val="top"/>
+            <w:shd w:fill="FFFFFF"/>
+            <w:tcBorders>
+              <w:top w:val="single" w:sz="6" w:color="71838D"/>
+              <w:left w:val="single" w:sz="6" w:color="71838D"/>
+              <w:bottom w:val="single" w:sz="6" w:color="71838D"/>
+              <w:right w:val="single" w:sz="6" w:color="71838D"/>
+            </w:tcBorders>
+            <w:tcMar>
+              <w:top w:w="115" w:type="dxa"/>
+              <w:bottom w:w="115" w:type="dxa"/>
+              <w:left w:w="115" w:type="dxa"/>
+              <w:right w:w="115" w:type="dxa"/>
+            </w:tcMar>
+          </w:tcPr>
+          <w:sdt>
+            <w:sdtPr>
+              <w:alias w:val="Anything still needed"/>
+              <w:tag w:val="outstanding_actions"/>
+              <w:id w:val="111"/>
+              <w:text w:multiLine="1"/>
+            </w:sdtPr>
+            <w:sdtContent>
+              <w:p>
+                <w:pPr>
+                  <w:pStyle w:val="Answer"/>
+                </w:pPr>
+                <w:r>
+                  <w:rPr>
+                    <w:rFonts w:ascii="Frutiger LT Com 45 Light" w:hAnsi="Frutiger LT Com 45 Light"/>
+                    <w:sz w:val="28"/>
+                  </w:rPr>
+                  <w:t xml:space="preserve"> </w:t>
+                </w:r>
+              </w:p>
+            </w:sdtContent>
+          </w:sdt>
+        </w:tc>
+      </w:tr>
+    </w:tbl>
+    <w:p>
+      <w:pPr>
+        <w:spacing w:after="0" w:before="0" w:line="60" w:lineRule="exact"/>
+      </w:pPr>
+      <w:r>
+        <w:rPr>
+          <w:sz w:val="2"/>
+        </w:rPr>
+      </w:r>
     </w:p>
     <w:p>
       <w:pPr>
-        <w:keepNext w:val="0"/>
+        <w:spacing w:after="0"/>
       </w:pPr>
       <w:r>
         <w:rPr>
-          <w:sz w:val="19"/>
+          <w:sz w:val="27"/>
         </w:rPr>
-        <w:t>If checks are incomplete, resolve them before the call. Save this form in the agreed record.</w:t>
+        <w:t>Include the action, who will do it and when.</w:t>
+        <w:br/>
+        <w:t>Resolve incomplete checks before the call. Save in the agreed record.</w:t>
       </w:r>
     </w:p>
     <w:sectPr>
       <w:headerReference w:type="default" r:id="rId9"/>
       <w:footerReference w:type="default" r:id="rId10"/>
       <w:pgSz w:w="11906" w:h="16838"/>
-      <w:pgMar w:top="1502" w:right="1020" w:bottom="935" w:left="1020" w:header="369" w:footer="397" w:gutter="0"/>
+      <w:pgMar w:top="964" w:right="850" w:bottom="907" w:left="850" w:header="397" w:footer="397" w:gutter="0"/>
       <w:cols w:space="720"/>
       <w:docGrid w:linePitch="360"/>
     </w:sectPr>
@@ -480,14 +977,59 @@
   <w:p>
     <w:pPr>
       <w:pStyle w:val="Footer"/>
+      <w:tabs>
+        <w:tab w:pos="10205" w:val="right"/>
+      </w:tabs>
       <w:spacing w:after="0"/>
     </w:pPr>
     <w:r>
-      <w:t xml:space="preserve">Staff forms · Version 12 · 25 October 2026   |   Page </w:t>
+      <w:rPr>
+        <w:rFonts w:ascii="Frutiger LT Com 45 Light" w:hAnsi="Frutiger LT Com 45 Light"/>
+        <w:sz w:val="20"/>
+      </w:rPr>
+      <w:t>Discharge Project</w:t>
+    </w:r>
+    <w:r>
+      <w:rPr>
+        <w:rFonts w:ascii="Frutiger LT Com 45 Light" w:hAnsi="Frutiger LT Com 45 Light"/>
+        <w:sz w:val="20"/>
+      </w:rPr>
+      <w:tab/>
+      <w:t xml:space="preserve">Page </w:t>
     </w:r>
     <w:fldSimple w:instr="PAGE">
-      <w:r/>
+      <w:r>
+        <w:rPr>
+          <w:rFonts w:ascii="Frutiger LT Com 45 Light" w:hAnsi="Frutiger LT Com 45 Light" w:eastAsia="Frutiger LT Com 45 Light" w:cs="Frutiger LT Com 45 Light"/>
+          <w:sz w:val="20"/>
+          <w:color w:val="172C38"/>
+        </w:rPr>
+        <w:t>1</w:t>
+      </w:r>
     </w:fldSimple>
+    <w:r>
+      <w:rPr>
+        <w:rFonts w:ascii="Frutiger LT Com 45 Light" w:hAnsi="Frutiger LT Com 45 Light"/>
+        <w:sz w:val="20"/>
+      </w:rPr>
+      <w:t xml:space="preserve"> of </w:t>
+    </w:r>
+    <w:fldSimple w:instr="NUMPAGES">
+      <w:r>
+        <w:rPr>
+          <w:rFonts w:ascii="Frutiger LT Com 45 Light" w:hAnsi="Frutiger LT Com 45 Light" w:eastAsia="Frutiger LT Com 45 Light" w:cs="Frutiger LT Com 45 Light"/>
+          <w:sz w:val="20"/>
+          <w:color w:val="172C38"/>
+        </w:rPr>
+        <w:t>1</w:t>
+      </w:r>
+    </w:fldSimple>
+    <w:r>
+      <w:rPr>
+        <w:rFonts w:ascii="Frutiger LT Com 45 Light" w:hAnsi="Frutiger LT Com 45 Light"/>
+        <w:sz w:val="20"/>
+      </w:rPr>
+    </w:r>
   </w:p>
 </w:ftr>
 </file>
@@ -497,174 +1039,17 @@
   <w:p>
     <w:pPr>
       <w:pStyle w:val="Header"/>
-      <w:spacing w:after="0" w:line="240" w:lineRule="auto" w:before="0"/>
+      <w:spacing w:after="0"/>
     </w:pPr>
     <w:r>
       <w:rPr>
-        <w:sz w:val="2"/>
-      </w:rPr>
+        <w:rFonts w:ascii="Frutiger LT Com 45 Light" w:hAnsi="Frutiger LT Com 45 Light"/>
+        <w:color w:val="314C59"/>
+        <w:sz w:val="22"/>
+      </w:rPr>
+      <w:t>CNWL  |  Lived Experience Workforce</w:t>
     </w:r>
   </w:p>
-  <w:tbl>
-    <w:tblPr>
-      <w:tblW w:type="auto" w:w="0"/>
-      <w:tblLayout w:type="fixed"/>
-      <w:tblLook w:firstColumn="1" w:firstRow="1" w:lastColumn="0" w:lastRow="0" w:noHBand="0" w:noVBand="1" w:val="04A0"/>
-      <w:tblBorders>
-        <w:top w:val="nil"/>
-        <w:left w:val="nil"/>
-        <w:bottom w:val="nil"/>
-        <w:right w:val="nil"/>
-        <w:insideH w:val="nil"/>
-        <w:insideV w:val="nil"/>
-      </w:tblBorders>
-    </w:tblPr>
-    <w:tblGrid>
-      <w:gridCol w:w="1616"/>
-      <w:gridCol w:w="7115"/>
-      <w:gridCol w:w="1134"/>
-    </w:tblGrid>
-    <w:tr>
-      <w:tc>
-        <w:tcPr>
-          <w:tcW w:type="dxa" w:w="1616"/>
-          <w:vAlign w:val="center"/>
-          <w:tcMar>
-            <w:top w:w="40" w:type="dxa"/>
-            <w:bottom w:w="40" w:type="dxa"/>
-            <w:left w:w="70" w:type="dxa"/>
-            <w:right w:w="70" w:type="dxa"/>
-          </w:tcMar>
-          <w:shd w:fill="005EB8"/>
-        </w:tcPr>
-        <w:p>
-          <w:pPr>
-            <w:spacing w:after="0" w:line="240" w:lineRule="auto"/>
-            <w:jc w:val="center"/>
-          </w:pPr>
-          <w:r>
-            <w:drawing>
-              <wp:inline xmlns:a="http://schemas.openxmlformats.org/drawingml/2006/main" xmlns:pic="http://schemas.openxmlformats.org/drawingml/2006/picture">
-                <wp:extent cx="827999" cy="403200"/>
-                <wp:docPr id="1" name="Picture 1" descr="Central and North West London NHS Foundation Trust"/>
-                <wp:cNvGraphicFramePr>
-                  <a:graphicFrameLocks noChangeAspect="1"/>
-                </wp:cNvGraphicFramePr>
-                <a:graphic>
-                  <a:graphicData uri="http://schemas.openxmlformats.org/drawingml/2006/picture">
-                    <pic:pic>
-                      <pic:nvPicPr>
-                        <pic:cNvPr id="0" name="CNWL_Logo.png"/>
-                        <pic:cNvPicPr/>
-                      </pic:nvPicPr>
-                      <pic:blipFill>
-                        <a:blip r:embed="rId1"/>
-                        <a:stretch>
-                          <a:fillRect/>
-                        </a:stretch>
-                      </pic:blipFill>
-                      <pic:spPr>
-                        <a:xfrm>
-                          <a:off x="0" y="0"/>
-                          <a:ext cx="827999" cy="403200"/>
-                        </a:xfrm>
-                        <a:prstGeom prst="rect"/>
-                      </pic:spPr>
-                    </pic:pic>
-                  </a:graphicData>
-                </a:graphic>
-              </wp:inline>
-            </w:drawing>
-          </w:r>
-        </w:p>
-      </w:tc>
-      <w:tc>
-        <w:tcPr>
-          <w:tcW w:type="dxa" w:w="7115"/>
-          <w:vAlign w:val="center"/>
-          <w:tcMar>
-            <w:top w:w="40" w:type="dxa"/>
-            <w:bottom w:w="40" w:type="dxa"/>
-            <w:left w:w="70" w:type="dxa"/>
-            <w:right w:w="70" w:type="dxa"/>
-          </w:tcMar>
-        </w:tcPr>
-        <w:p>
-          <w:pPr>
-            <w:spacing w:after="0" w:line="240" w:lineRule="auto"/>
-          </w:pPr>
-          <w:r>
-            <w:rPr>
-              <w:b/>
-              <w:sz w:val="20"/>
-            </w:rPr>
-            <w:t>Lived Experience Discharge</w:t>
-            <w:br/>
-            <w:t>and Transition Project</w:t>
-          </w:r>
-          <w:r>
-            <w:rPr>
-              <w:sz w:val="17"/>
-            </w:rPr>
-            <w:br/>
-            <w:t>CNWL Peer and Lived Experience Workforce</w:t>
-          </w:r>
-        </w:p>
-      </w:tc>
-      <w:tc>
-        <w:tcPr>
-          <w:tcW w:type="dxa" w:w="1134"/>
-          <w:vAlign w:val="center"/>
-          <w:tcMar>
-            <w:top w:w="40" w:type="dxa"/>
-            <w:bottom w:w="40" w:type="dxa"/>
-            <w:left w:w="70" w:type="dxa"/>
-            <w:right w:w="70" w:type="dxa"/>
-          </w:tcMar>
-        </w:tcPr>
-        <w:p>
-          <w:pPr>
-            <w:spacing w:after="0" w:line="240" w:lineRule="auto"/>
-            <w:jc w:val="right"/>
-          </w:pPr>
-          <w:r>
-            <w:drawing>
-              <wp:inline xmlns:a="http://schemas.openxmlformats.org/drawingml/2006/main" xmlns:pic="http://schemas.openxmlformats.org/drawingml/2006/picture">
-                <wp:extent cx="483290" cy="450000"/>
-                <wp:docPr id="2" name="Picture 2" descr="CNWL Peer and Lived Experience Workforce"/>
-                <wp:cNvGraphicFramePr>
-                  <a:graphicFrameLocks noChangeAspect="1"/>
-                </wp:cNvGraphicFramePr>
-                <a:graphic>
-                  <a:graphicData uri="http://schemas.openxmlformats.org/drawingml/2006/picture">
-                    <pic:pic>
-                      <pic:nvPicPr>
-                        <pic:cNvPr id="0" name="Lived_Experience_Logo.png"/>
-                        <pic:cNvPicPr/>
-                      </pic:nvPicPr>
-                      <pic:blipFill>
-                        <a:blip r:embed="rId2"/>
-                        <a:stretch>
-                          <a:fillRect/>
-                        </a:stretch>
-                      </pic:blipFill>
-                      <pic:spPr>
-                        <a:xfrm>
-                          <a:off x="0" y="0"/>
-                          <a:ext cx="483290" cy="450000"/>
-                        </a:xfrm>
-                        <a:prstGeom prst="rect"/>
-                      </pic:spPr>
-                    </pic:pic>
-                  </a:graphicData>
-                </a:graphic>
-              </wp:inline>
-            </w:drawing>
-          </w:r>
-        </w:p>
-      </w:tc>
-    </w:tr>
-  </w:tbl>
 </w:hdr>
 </file>
 
@@ -1032,12 +1417,13 @@
     <w:qFormat/>
     <w:rsid w:val="00FC693F"/>
     <w:pPr>
-      <w:spacing w:before="0" w:after="80" w:line="250" w:lineRule="auto"/>
+      <w:widowControl/>
+      <w:spacing w:line="269" w:lineRule="auto" w:after="100"/>
     </w:pPr>
     <w:rPr>
-      <w:rFonts w:ascii="Arial" w:hAnsi="Arial"/>
-      <w:color w:val="000000"/>
-      <w:sz w:val="22"/>
+      <w:rFonts w:ascii="Frutiger LT Com 45 Light" w:hAnsi="Frutiger LT Com 45 Light" w:eastAsia="Frutiger LT Com 45 Light" w:cs="Frutiger LT Com 45 Light"/>
+      <w:sz w:val="28"/>
+      <w:color w:val="172C38"/>
     </w:rPr>
   </w:style>
   <w:style w:type="paragraph" w:styleId="Header">
@@ -1052,13 +1438,8 @@
         <w:tab w:val="center" w:pos="4680"/>
         <w:tab w:val="right" w:pos="9360"/>
       </w:tabs>
-      <w:spacing w:after="80" w:line="254" w:lineRule="auto" w:before="0"/>
-    </w:pPr>
-    <w:rPr>
-      <w:rFonts w:ascii="Arial" w:hAnsi="Arial"/>
-      <w:color w:val="000000"/>
-      <w:sz w:val="18"/>
-    </w:rPr>
+      <w:spacing w:after="0" w:line="240" w:lineRule="auto"/>
+    </w:pPr>
   </w:style>
   <w:style w:type="character" w:customStyle="1" w:styleId="HeaderChar">
     <w:name w:val="Header Char"/>
@@ -1075,17 +1456,8 @@
     <w:unhideWhenUsed/>
     <w:rsid w:val="00E618BF"/>
     <w:pPr>
-      <w:tabs>
-        <w:tab w:val="center" w:pos="4680"/>
-        <w:tab w:val="right" w:pos="9360"/>
-      </w:tabs>
-      <w:spacing w:after="80" w:line="254" w:lineRule="auto" w:before="0"/>
-    </w:pPr>
-    <w:rPr>
-      <w:rFonts w:ascii="Arial" w:hAnsi="Arial"/>
-      <w:color w:val="000000"/>
-      <w:sz w:val="18"/>
-    </w:rPr>
+      <w:spacing w:after="0" w:line="240" w:lineRule="auto"/>
+    </w:pPr>
   </w:style>
   <w:style w:type="character" w:customStyle="1" w:styleId="FooterChar">
     <w:name w:val="Footer Char"/>
@@ -1105,16 +1477,16 @@
     <w:pPr>
       <w:keepNext/>
       <w:keepLines/>
-      <w:spacing w:before="0" w:after="80" w:line="254" w:lineRule="auto"/>
+      <w:spacing w:before="200" w:after="140"/>
       <w:outlineLvl w:val="0"/>
     </w:pPr>
     <w:rPr>
-      <w:rFonts w:asciiTheme="majorHAnsi" w:eastAsiaTheme="majorEastAsia" w:hAnsiTheme="majorHAnsi" w:cstheme="majorBidi" w:ascii="Arial" w:hAnsi="Arial"/>
+      <w:bCs/>
+      <w:szCs w:val="28"/>
+      <w:rFonts w:ascii="Frutiger LT Com 45 Light" w:hAnsi="Frutiger LT Com 45 Light" w:eastAsia="Frutiger LT Com 45 Light" w:cs="Frutiger LT Com 45 Light"/>
+      <w:sz w:val="48"/>
+      <w:color w:val="000000"/>
       <w:b/>
-      <w:bCs/>
-      <w:color w:val="000000"/>
-      <w:sz w:val="36"/>
-      <w:szCs w:val="28"/>
     </w:rPr>
   </w:style>
   <w:style w:type="paragraph" w:styleId="Heading2">
@@ -1129,16 +1501,16 @@
     <w:pPr>
       <w:keepNext/>
       <w:keepLines/>
-      <w:spacing w:before="160" w:after="80" w:line="254" w:lineRule="auto"/>
+      <w:spacing w:before="200" w:after="140"/>
       <w:outlineLvl w:val="1"/>
     </w:pPr>
     <w:rPr>
-      <w:rFonts w:asciiTheme="majorHAnsi" w:eastAsiaTheme="majorEastAsia" w:hAnsiTheme="majorHAnsi" w:cstheme="majorBidi" w:ascii="Arial" w:hAnsi="Arial"/>
+      <w:bCs/>
+      <w:szCs w:val="26"/>
+      <w:rFonts w:ascii="Frutiger LT Com 45 Light" w:hAnsi="Frutiger LT Com 45 Light" w:eastAsia="Frutiger LT Com 45 Light" w:cs="Frutiger LT Com 45 Light"/>
+      <w:sz w:val="32"/>
+      <w:color w:val="000000"/>
       <w:b/>
-      <w:bCs/>
-      <w:color w:val="000000"/>
-      <w:sz w:val="24"/>
-      <w:szCs w:val="26"/>
     </w:rPr>
   </w:style>
   <w:style w:type="paragraph" w:styleId="Heading3">
@@ -1153,15 +1525,14 @@
     <w:pPr>
       <w:keepNext/>
       <w:keepLines/>
-      <w:spacing w:before="0" w:after="80" w:line="254" w:lineRule="auto"/>
+      <w:spacing w:before="200" w:after="0"/>
       <w:outlineLvl w:val="2"/>
     </w:pPr>
     <w:rPr>
-      <w:rFonts w:asciiTheme="majorHAnsi" w:eastAsiaTheme="majorEastAsia" w:hAnsiTheme="majorHAnsi" w:cstheme="majorBidi" w:ascii="Arial" w:hAnsi="Arial"/>
+      <w:rFonts w:asciiTheme="majorHAnsi" w:eastAsiaTheme="majorEastAsia" w:hAnsiTheme="majorHAnsi" w:cstheme="majorBidi"/>
       <w:b/>
       <w:bCs/>
-      <w:color w:val="000000"/>
-      <w:sz w:val="22"/>
+      <w:color w:val="4F81BD" w:themeColor="accent1"/>
     </w:rPr>
   </w:style>
   <w:style w:type="paragraph" w:styleId="Heading4">
@@ -1392,17 +1763,18 @@
     <w:qFormat/>
     <w:rsid w:val="00FC693F"/>
     <w:pPr>
-      <w:spacing w:after="80" w:line="254" w:lineRule="auto" w:before="0"/>
+      <w:keepNext/>
+      <w:spacing w:after="140" w:line="240" w:lineRule="auto" w:before="0"/>
       <w:contextualSpacing/>
     </w:pPr>
     <w:rPr>
-      <w:rFonts w:asciiTheme="majorHAnsi" w:eastAsiaTheme="majorEastAsia" w:hAnsiTheme="majorHAnsi" w:cstheme="majorBidi" w:ascii="Arial" w:hAnsi="Arial"/>
-      <w:b/>
-      <w:color w:val="000000"/>
       <w:spacing w:val="5"/>
       <w:kern w:val="28"/>
-      <w:sz w:val="40"/>
       <w:szCs w:val="52"/>
+      <w:rFonts w:ascii="Frutiger LT Com 45 Light" w:hAnsi="Frutiger LT Com 45 Light" w:eastAsia="Frutiger LT Com 45 Light" w:cs="Frutiger LT Com 45 Light"/>
+      <w:sz w:val="60"/>
+      <w:color w:val="000000"/>
+      <w:b/>
     </w:rPr>
   </w:style>
   <w:style w:type="character" w:customStyle="1" w:styleId="TitleChar">
@@ -1432,15 +1804,14 @@
       <w:numPr>
         <w:ilvl w:val="1"/>
       </w:numPr>
-      <w:spacing w:before="0" w:after="80" w:line="254" w:lineRule="auto"/>
     </w:pPr>
     <w:rPr>
-      <w:rFonts w:asciiTheme="majorHAnsi" w:eastAsiaTheme="majorEastAsia" w:hAnsiTheme="majorHAnsi" w:cstheme="majorBidi" w:ascii="Arial" w:hAnsi="Arial"/>
+      <w:rFonts w:asciiTheme="majorHAnsi" w:eastAsiaTheme="majorEastAsia" w:hAnsiTheme="majorHAnsi" w:cstheme="majorBidi"/>
       <w:i/>
       <w:iCs/>
-      <w:color w:val="000000"/>
+      <w:color w:val="4F81BD" w:themeColor="accent1"/>
       <w:spacing w:val="15"/>
-      <w:sz w:val="22"/>
+      <w:sz w:val="24"/>
       <w:szCs w:val="24"/>
     </w:rPr>
   </w:style>
@@ -12728,6 +13099,20 @@
         <w:shd w:val="clear" w:color="auto" w:fill="FBCAA2" w:themeFill="accent6" w:themeFillTint="7F"/>
       </w:tcPr>
     </w:tblStylePr>
+  </w:style>
+  <w:style w:type="paragraph" w:customStyle="1" w:styleId="Answer">
+    <w:name w:val="Answer"/>
+    <w:basedOn w:val="Normal"/>
+    <w:pPr>
+      <w:keepNext w:val="0"/>
+      <w:keepLines w:val="0"/>
+      <w:widowControl w:val="0"/>
+      <w:spacing w:before="0" w:after="0" w:line="269" w:lineRule="auto"/>
+    </w:pPr>
+    <w:rPr>
+      <w:rFonts w:ascii="Frutiger LT Com 45 Light" w:hAnsi="Frutiger LT Com 45 Light"/>
+      <w:sz w:val="28"/>
+    </w:rPr>
   </w:style>
 </w:styles>
 </file>

</xml_diff>